<commit_message>
Deploying to gh-pages from @ UCD-SERG/serocalculator@43cce65d2614e312026270e7045e29d0cade43f1 🚀
</commit_message>
<xml_diff>
--- a/dev/vignettes/articles/scrubTyphus_example.docx
+++ b/dev/vignettes/articles/scrubTyphus_example.docx
@@ -23,7 +23,7 @@
         <w:pStyle w:val="Date"/>
       </w:pPr>
       <w:r>
-        <w:t xml:space="preserve">2026-07-25</w:t>
+        <w:t xml:space="preserve">2026-07-26</w:t>
       </w:r>
     </w:p>
     <w:bookmarkStart w:id="10" w:name="introduction"/>
@@ -410,6 +410,53 @@
         <w:t xml:space="preserve">our active R session environment:</w:t>
       </w:r>
     </w:p>
+    <w:p>
+      <w:pPr>
+        <w:pStyle w:val="SourceCode"/>
+      </w:pPr>
+      <w:r>
+        <w:rPr>
+          <w:rStyle w:val="FunctionTok"/>
+        </w:rPr>
+        <w:t xml:space="preserve">library</w:t>
+      </w:r>
+      <w:r>
+        <w:rPr>
+          <w:rStyle w:val="NormalTok"/>
+        </w:rPr>
+        <w:t xml:space="preserve">(serocalculator)</w:t>
+      </w:r>
+      <w:r>
+        <w:br/>
+      </w:r>
+      <w:r>
+        <w:rPr>
+          <w:rStyle w:val="FunctionTok"/>
+        </w:rPr>
+        <w:t xml:space="preserve">library</w:t>
+      </w:r>
+      <w:r>
+        <w:rPr>
+          <w:rStyle w:val="NormalTok"/>
+        </w:rPr>
+        <w:t xml:space="preserve">(tidyverse)</w:t>
+      </w:r>
+      <w:r>
+        <w:br/>
+      </w:r>
+      <w:r>
+        <w:rPr>
+          <w:rStyle w:val="FunctionTok"/>
+        </w:rPr>
+        <w:t xml:space="preserve">library</w:t>
+      </w:r>
+      <w:r>
+        <w:rPr>
+          <w:rStyle w:val="NormalTok"/>
+        </w:rPr>
+        <w:t xml:space="preserve">(mixtools)</w:t>
+      </w:r>
+    </w:p>
     <w:bookmarkEnd w:id="16"/>
     <w:bookmarkStart w:id="30" w:name="load-data"/>
     <w:p>
@@ -484,7 +531,88 @@
       </w:pPr>
       <w:r>
         <w:rPr>
-          <w:rStyle w:val="VerbatimChar"/>
+          <w:rStyle w:val="CommentTok"/>
+        </w:rPr>
+        <w:t xml:space="preserve"># Import longitudinal antibody parameters from OSF</w:t>
+      </w:r>
+      <w:r>
+        <w:br/>
+      </w:r>
+      <w:r>
+        <w:br/>
+      </w:r>
+      <w:r>
+        <w:rPr>
+          <w:rStyle w:val="NormalTok"/>
+        </w:rPr>
+        <w:t xml:space="preserve">curves </w:t>
+      </w:r>
+      <w:r>
+        <w:rPr>
+          <w:rStyle w:val="OtherTok"/>
+        </w:rPr>
+        <w:t xml:space="preserve">&lt;-</w:t>
+      </w:r>
+      <w:r>
+        <w:br/>
+      </w:r>
+      <w:r>
+        <w:rPr>
+          <w:rStyle w:val="NormalTok"/>
+        </w:rPr>
+        <w:t xml:space="preserve">  </w:t>
+      </w:r>
+      <w:r>
+        <w:rPr>
+          <w:rStyle w:val="StringTok"/>
+        </w:rPr>
+        <w:t xml:space="preserve">"https://osf.io/download/u5gxh/"</w:t>
+      </w:r>
+      <w:r>
+        <w:rPr>
+          <w:rStyle w:val="NormalTok"/>
+        </w:rPr>
+        <w:t xml:space="preserve"> </w:t>
+      </w:r>
+      <w:r>
+        <w:rPr>
+          <w:rStyle w:val="SpecialCharTok"/>
+        </w:rPr>
+        <w:t xml:space="preserve">|&gt;</w:t>
+      </w:r>
+      <w:r>
+        <w:rPr>
+          <w:rStyle w:val="NormalTok"/>
+        </w:rPr>
+        <w:t xml:space="preserve"> </w:t>
+      </w:r>
+      <w:r>
+        <w:br/>
+      </w:r>
+      <w:r>
+        <w:rPr>
+          <w:rStyle w:val="NormalTok"/>
+        </w:rPr>
+        <w:t xml:space="preserve">  </w:t>
+      </w:r>
+      <w:r>
+        <w:rPr>
+          <w:rStyle w:val="FunctionTok"/>
+        </w:rPr>
+        <w:t xml:space="preserve">load_sr_params</w:t>
+      </w:r>
+      <w:r>
+        <w:rPr>
+          <w:rStyle w:val="NormalTok"/>
+        </w:rPr>
+        <w:t xml:space="preserve">()</w:t>
+      </w:r>
+      <w:r>
+        <w:br/>
+      </w:r>
+      <w:r>
+        <w:rPr>
+          <w:rStyle w:val="CommentTok"/>
         </w:rPr>
         <w:t xml:space="preserve">#&gt; Warning: `data` is missing `iter` column</w:t>
       </w:r>
@@ -493,7 +621,7 @@
       </w:r>
       <w:r>
         <w:rPr>
-          <w:rStyle w:val="VerbatimChar"/>
+          <w:rStyle w:val="CommentTok"/>
         </w:rPr>
         <w:t xml:space="preserve">#&gt; It will be inferred from row ordering.</w:t>
       </w:r>
@@ -533,7 +661,42 @@
     </w:p>
     <w:p>
       <w:pPr>
-        <w:pStyle w:val="BodyText"/>
+        <w:pStyle w:val="SourceCode"/>
+      </w:pPr>
+      <w:r>
+        <w:rPr>
+          <w:rStyle w:val="NormalTok"/>
+        </w:rPr>
+        <w:t xml:space="preserve">curves </w:t>
+      </w:r>
+      <w:r>
+        <w:rPr>
+          <w:rStyle w:val="SpecialCharTok"/>
+        </w:rPr>
+        <w:t xml:space="preserve">|&gt;</w:t>
+      </w:r>
+      <w:r>
+        <w:rPr>
+          <w:rStyle w:val="NormalTok"/>
+        </w:rPr>
+        <w:t xml:space="preserve"> </w:t>
+      </w:r>
+      <w:r>
+        <w:rPr>
+          <w:rStyle w:val="FunctionTok"/>
+        </w:rPr>
+        <w:t xml:space="preserve">autoplot</w:t>
+      </w:r>
+      <w:r>
+        <w:rPr>
+          <w:rStyle w:val="NormalTok"/>
+        </w:rPr>
+        <w:t xml:space="preserve">()</w:t>
+      </w:r>
+    </w:p>
+    <w:p>
+      <w:pPr>
+        <w:pStyle w:val="FirstParagraph"/>
       </w:pPr>
       <w:r>
         <w:drawing>
@@ -596,6 +759,218 @@
         <w:t xml:space="preserve">Next, we load our sample cross-sectional data.</w:t>
       </w:r>
     </w:p>
+    <w:p>
+      <w:pPr>
+        <w:pStyle w:val="SourceCode"/>
+      </w:pPr>
+      <w:r>
+        <w:rPr>
+          <w:rStyle w:val="CommentTok"/>
+        </w:rPr>
+        <w:t xml:space="preserve"># Import cross-sectional data from OSF and rename required variables</w:t>
+      </w:r>
+      <w:r>
+        <w:br/>
+      </w:r>
+      <w:r>
+        <w:rPr>
+          <w:rStyle w:val="NormalTok"/>
+        </w:rPr>
+        <w:t xml:space="preserve">xs_data </w:t>
+      </w:r>
+      <w:r>
+        <w:rPr>
+          <w:rStyle w:val="OtherTok"/>
+        </w:rPr>
+        <w:t xml:space="preserve">&lt;-</w:t>
+      </w:r>
+      <w:r>
+        <w:rPr>
+          <w:rStyle w:val="NormalTok"/>
+        </w:rPr>
+        <w:t xml:space="preserve"> </w:t>
+      </w:r>
+      <w:r>
+        <w:rPr>
+          <w:rStyle w:val="FunctionTok"/>
+        </w:rPr>
+        <w:t xml:space="preserve">load_pop_data</w:t>
+      </w:r>
+      <w:r>
+        <w:rPr>
+          <w:rStyle w:val="NormalTok"/>
+        </w:rPr>
+        <w:t xml:space="preserve">(</w:t>
+      </w:r>
+      <w:r>
+        <w:br/>
+      </w:r>
+      <w:r>
+        <w:rPr>
+          <w:rStyle w:val="NormalTok"/>
+        </w:rPr>
+        <w:t xml:space="preserve">  </w:t>
+      </w:r>
+      <w:r>
+        <w:rPr>
+          <w:rStyle w:val="AttributeTok"/>
+        </w:rPr>
+        <w:t xml:space="preserve">file_path =</w:t>
+      </w:r>
+      <w:r>
+        <w:rPr>
+          <w:rStyle w:val="NormalTok"/>
+        </w:rPr>
+        <w:t xml:space="preserve"> </w:t>
+      </w:r>
+      <w:r>
+        <w:rPr>
+          <w:rStyle w:val="StringTok"/>
+        </w:rPr>
+        <w:t xml:space="preserve">"https://osf.io/download/h5js4/"</w:t>
+      </w:r>
+      <w:r>
+        <w:rPr>
+          <w:rStyle w:val="NormalTok"/>
+        </w:rPr>
+        <w:t xml:space="preserve">,</w:t>
+      </w:r>
+      <w:r>
+        <w:br/>
+      </w:r>
+      <w:r>
+        <w:rPr>
+          <w:rStyle w:val="NormalTok"/>
+        </w:rPr>
+        <w:t xml:space="preserve">  </w:t>
+      </w:r>
+      <w:r>
+        <w:rPr>
+          <w:rStyle w:val="AttributeTok"/>
+        </w:rPr>
+        <w:t xml:space="preserve">age =</w:t>
+      </w:r>
+      <w:r>
+        <w:rPr>
+          <w:rStyle w:val="NormalTok"/>
+        </w:rPr>
+        <w:t xml:space="preserve"> </w:t>
+      </w:r>
+      <w:r>
+        <w:rPr>
+          <w:rStyle w:val="StringTok"/>
+        </w:rPr>
+        <w:t xml:space="preserve">"Age"</w:t>
+      </w:r>
+      <w:r>
+        <w:rPr>
+          <w:rStyle w:val="NormalTok"/>
+        </w:rPr>
+        <w:t xml:space="preserve">,</w:t>
+      </w:r>
+      <w:r>
+        <w:br/>
+      </w:r>
+      <w:r>
+        <w:rPr>
+          <w:rStyle w:val="NormalTok"/>
+        </w:rPr>
+        <w:t xml:space="preserve">  </w:t>
+      </w:r>
+      <w:r>
+        <w:rPr>
+          <w:rStyle w:val="AttributeTok"/>
+        </w:rPr>
+        <w:t xml:space="preserve">value =</w:t>
+      </w:r>
+      <w:r>
+        <w:rPr>
+          <w:rStyle w:val="NormalTok"/>
+        </w:rPr>
+        <w:t xml:space="preserve"> </w:t>
+      </w:r>
+      <w:r>
+        <w:rPr>
+          <w:rStyle w:val="StringTok"/>
+        </w:rPr>
+        <w:t xml:space="preserve">"result"</w:t>
+      </w:r>
+      <w:r>
+        <w:rPr>
+          <w:rStyle w:val="NormalTok"/>
+        </w:rPr>
+        <w:t xml:space="preserve">,</w:t>
+      </w:r>
+      <w:r>
+        <w:br/>
+      </w:r>
+      <w:r>
+        <w:rPr>
+          <w:rStyle w:val="NormalTok"/>
+        </w:rPr>
+        <w:t xml:space="preserve">  </w:t>
+      </w:r>
+      <w:r>
+        <w:rPr>
+          <w:rStyle w:val="AttributeTok"/>
+        </w:rPr>
+        <w:t xml:space="preserve">id =</w:t>
+      </w:r>
+      <w:r>
+        <w:rPr>
+          <w:rStyle w:val="NormalTok"/>
+        </w:rPr>
+        <w:t xml:space="preserve"> </w:t>
+      </w:r>
+      <w:r>
+        <w:rPr>
+          <w:rStyle w:val="StringTok"/>
+        </w:rPr>
+        <w:t xml:space="preserve">"index_id"</w:t>
+      </w:r>
+      <w:r>
+        <w:rPr>
+          <w:rStyle w:val="NormalTok"/>
+        </w:rPr>
+        <w:t xml:space="preserve">,</w:t>
+      </w:r>
+      <w:r>
+        <w:br/>
+      </w:r>
+      <w:r>
+        <w:rPr>
+          <w:rStyle w:val="NormalTok"/>
+        </w:rPr>
+        <w:t xml:space="preserve">  </w:t>
+      </w:r>
+      <w:r>
+        <w:rPr>
+          <w:rStyle w:val="AttributeTok"/>
+        </w:rPr>
+        <w:t xml:space="preserve">standardize =</w:t>
+      </w:r>
+      <w:r>
+        <w:rPr>
+          <w:rStyle w:val="NormalTok"/>
+        </w:rPr>
+        <w:t xml:space="preserve"> </w:t>
+      </w:r>
+      <w:r>
+        <w:rPr>
+          <w:rStyle w:val="ConstantTok"/>
+        </w:rPr>
+        <w:t xml:space="preserve">TRUE</w:t>
+      </w:r>
+      <w:r>
+        <w:br/>
+      </w:r>
+      <w:r>
+        <w:rPr>
+          <w:rStyle w:val="NormalTok"/>
+        </w:rPr>
+        <w:t xml:space="preserve">)</w:t>
+      </w:r>
+    </w:p>
     <w:bookmarkEnd w:id="23"/>
     <w:bookmarkStart w:id="24" w:name="check-formatting"/>
     <w:p>
@@ -650,7 +1025,64 @@
       </w:pPr>
       <w:r>
         <w:rPr>
-          <w:rStyle w:val="VerbatimChar"/>
+          <w:rStyle w:val="NormalTok"/>
+        </w:rPr>
+        <w:t xml:space="preserve">xs_data </w:t>
+      </w:r>
+      <w:r>
+        <w:rPr>
+          <w:rStyle w:val="SpecialCharTok"/>
+        </w:rPr>
+        <w:t xml:space="preserve">|&gt;</w:t>
+      </w:r>
+      <w:r>
+        <w:rPr>
+          <w:rStyle w:val="NormalTok"/>
+        </w:rPr>
+        <w:t xml:space="preserve"> </w:t>
+      </w:r>
+      <w:r>
+        <w:rPr>
+          <w:rStyle w:val="FunctionTok"/>
+        </w:rPr>
+        <w:t xml:space="preserve">check_pop_data</w:t>
+      </w:r>
+      <w:r>
+        <w:rPr>
+          <w:rStyle w:val="NormalTok"/>
+        </w:rPr>
+        <w:t xml:space="preserve">(</w:t>
+      </w:r>
+      <w:r>
+        <w:rPr>
+          <w:rStyle w:val="AttributeTok"/>
+        </w:rPr>
+        <w:t xml:space="preserve">verbose =</w:t>
+      </w:r>
+      <w:r>
+        <w:rPr>
+          <w:rStyle w:val="NormalTok"/>
+        </w:rPr>
+        <w:t xml:space="preserve"> </w:t>
+      </w:r>
+      <w:r>
+        <w:rPr>
+          <w:rStyle w:val="ConstantTok"/>
+        </w:rPr>
+        <w:t xml:space="preserve">TRUE</w:t>
+      </w:r>
+      <w:r>
+        <w:rPr>
+          <w:rStyle w:val="NormalTok"/>
+        </w:rPr>
+        <w:t xml:space="preserve">)</w:t>
+      </w:r>
+      <w:r>
+        <w:br/>
+      </w:r>
+      <w:r>
+        <w:rPr>
+          <w:rStyle w:val="CommentTok"/>
         </w:rPr>
         <w:t xml:space="preserve">#&gt; data format is as expected.</w:t>
       </w:r>
@@ -709,7 +1141,64 @@
       </w:pPr>
       <w:r>
         <w:rPr>
-          <w:rStyle w:val="VerbatimChar"/>
+          <w:rStyle w:val="NormalTok"/>
+        </w:rPr>
+        <w:t xml:space="preserve">xs_data </w:t>
+      </w:r>
+      <w:r>
+        <w:rPr>
+          <w:rStyle w:val="SpecialCharTok"/>
+        </w:rPr>
+        <w:t xml:space="preserve">|&gt;</w:t>
+      </w:r>
+      <w:r>
+        <w:rPr>
+          <w:rStyle w:val="NormalTok"/>
+        </w:rPr>
+        <w:t xml:space="preserve"> </w:t>
+      </w:r>
+      <w:r>
+        <w:rPr>
+          <w:rStyle w:val="FunctionTok"/>
+        </w:rPr>
+        <w:t xml:space="preserve">summary</w:t>
+      </w:r>
+      <w:r>
+        <w:rPr>
+          <w:rStyle w:val="NormalTok"/>
+        </w:rPr>
+        <w:t xml:space="preserve">(</w:t>
+      </w:r>
+      <w:r>
+        <w:rPr>
+          <w:rStyle w:val="AttributeTok"/>
+        </w:rPr>
+        <w:t xml:space="preserve">strata =</w:t>
+      </w:r>
+      <w:r>
+        <w:rPr>
+          <w:rStyle w:val="NormalTok"/>
+        </w:rPr>
+        <w:t xml:space="preserve"> </w:t>
+      </w:r>
+      <w:r>
+        <w:rPr>
+          <w:rStyle w:val="StringTok"/>
+        </w:rPr>
+        <w:t xml:space="preserve">"country"</w:t>
+      </w:r>
+      <w:r>
+        <w:rPr>
+          <w:rStyle w:val="NormalTok"/>
+        </w:rPr>
+        <w:t xml:space="preserve">)</w:t>
+      </w:r>
+      <w:r>
+        <w:br/>
+      </w:r>
+      <w:r>
+        <w:rPr>
+          <w:rStyle w:val="CommentTok"/>
         </w:rPr>
         <w:t xml:space="preserve">#&gt; Warning: There were 2 warnings in `dplyr::summarize()`.</w:t>
       </w:r>
@@ -718,7 +1207,7 @@
       </w:r>
       <w:r>
         <w:rPr>
-          <w:rStyle w:val="VerbatimChar"/>
+          <w:rStyle w:val="CommentTok"/>
         </w:rPr>
         <w:t xml:space="preserve">#&gt; The first warning was:</w:t>
       </w:r>
@@ -727,7 +1216,7 @@
       </w:r>
       <w:r>
         <w:rPr>
-          <w:rStyle w:val="VerbatimChar"/>
+          <w:rStyle w:val="CommentTok"/>
         </w:rPr>
         <w:t xml:space="preserve">#&gt; ℹ In argument: `across(...)`.</w:t>
       </w:r>
@@ -736,7 +1225,7 @@
       </w:r>
       <w:r>
         <w:rPr>
-          <w:rStyle w:val="VerbatimChar"/>
+          <w:rStyle w:val="CommentTok"/>
         </w:rPr>
         <w:t xml:space="preserve">#&gt; ℹ In group 4: `antigen_iso = OT56kda_IgM`, `country = Nepal`.</w:t>
       </w:r>
@@ -745,7 +1234,7 @@
       </w:r>
       <w:r>
         <w:rPr>
-          <w:rStyle w:val="VerbatimChar"/>
+          <w:rStyle w:val="CommentTok"/>
         </w:rPr>
         <w:t xml:space="preserve">#&gt; Caused by warning in `min()`:</w:t>
       </w:r>
@@ -754,7 +1243,7 @@
       </w:r>
       <w:r>
         <w:rPr>
-          <w:rStyle w:val="VerbatimChar"/>
+          <w:rStyle w:val="CommentTok"/>
         </w:rPr>
         <w:t xml:space="preserve">#&gt; ! no non-missing arguments to min; returning Inf</w:t>
       </w:r>
@@ -763,7 +1252,7 @@
       </w:r>
       <w:r>
         <w:rPr>
-          <w:rStyle w:val="VerbatimChar"/>
+          <w:rStyle w:val="CommentTok"/>
         </w:rPr>
         <w:t xml:space="preserve">#&gt; ℹ Run `dplyr::last_dplyr_warnings()` to see the 1 remaining warning.</w:t>
       </w:r>
@@ -772,7 +1261,7 @@
       </w:r>
       <w:r>
         <w:rPr>
-          <w:rStyle w:val="VerbatimChar"/>
+          <w:rStyle w:val="CommentTok"/>
         </w:rPr>
         <w:t xml:space="preserve">#&gt; </w:t>
       </w:r>
@@ -781,7 +1270,7 @@
       </w:r>
       <w:r>
         <w:rPr>
-          <w:rStyle w:val="VerbatimChar"/>
+          <w:rStyle w:val="CommentTok"/>
         </w:rPr>
         <w:t xml:space="preserve">#&gt; n = 1608 </w:t>
       </w:r>
@@ -790,7 +1279,7 @@
       </w:r>
       <w:r>
         <w:rPr>
-          <w:rStyle w:val="VerbatimChar"/>
+          <w:rStyle w:val="CommentTok"/>
         </w:rPr>
         <w:t xml:space="preserve">#&gt; </w:t>
       </w:r>
@@ -799,7 +1288,7 @@
       </w:r>
       <w:r>
         <w:rPr>
-          <w:rStyle w:val="VerbatimChar"/>
+          <w:rStyle w:val="CommentTok"/>
         </w:rPr>
         <w:t xml:space="preserve">#&gt; Distribution of age: </w:t>
       </w:r>
@@ -808,7 +1297,7 @@
       </w:r>
       <w:r>
         <w:rPr>
-          <w:rStyle w:val="VerbatimChar"/>
+          <w:rStyle w:val="CommentTok"/>
         </w:rPr>
         <w:t xml:space="preserve">#&gt; </w:t>
       </w:r>
@@ -817,7 +1306,7 @@
       </w:r>
       <w:r>
         <w:rPr>
-          <w:rStyle w:val="VerbatimChar"/>
+          <w:rStyle w:val="CommentTok"/>
         </w:rPr>
         <w:t xml:space="preserve">#&gt; # A tibble: 2 × 8</w:t>
       </w:r>
@@ -826,7 +1315,7 @@
       </w:r>
       <w:r>
         <w:rPr>
-          <w:rStyle w:val="VerbatimChar"/>
+          <w:rStyle w:val="CommentTok"/>
         </w:rPr>
         <w:t xml:space="preserve">#&gt;   country     n   min first_quartile median  mean third_quartile   max</w:t>
       </w:r>
@@ -835,7 +1324,7 @@
       </w:r>
       <w:r>
         <w:rPr>
-          <w:rStyle w:val="VerbatimChar"/>
+          <w:rStyle w:val="CommentTok"/>
         </w:rPr>
         <w:t xml:space="preserve">#&gt;   &lt;fct&gt;   &lt;int&gt; &lt;dbl&gt;          &lt;dbl&gt;  &lt;dbl&gt; &lt;dbl&gt;          &lt;dbl&gt; &lt;dbl&gt;</w:t>
       </w:r>
@@ -844,7 +1333,7 @@
       </w:r>
       <w:r>
         <w:rPr>
-          <w:rStyle w:val="VerbatimChar"/>
+          <w:rStyle w:val="CommentTok"/>
         </w:rPr>
         <w:t xml:space="preserve">#&gt; 1 India     721  18             40     49    50.5           62    87  </w:t>
       </w:r>
@@ -853,7 +1342,7 @@
       </w:r>
       <w:r>
         <w:rPr>
-          <w:rStyle w:val="VerbatimChar"/>
+          <w:rStyle w:val="CommentTok"/>
         </w:rPr>
         <w:t xml:space="preserve">#&gt; 2 Nepal     887   0.9            5.5   10.9  11.6           17.0  27.4</w:t>
       </w:r>
@@ -862,7 +1351,7 @@
       </w:r>
       <w:r>
         <w:rPr>
-          <w:rStyle w:val="VerbatimChar"/>
+          <w:rStyle w:val="CommentTok"/>
         </w:rPr>
         <w:t xml:space="preserve">#&gt; </w:t>
       </w:r>
@@ -871,7 +1360,7 @@
       </w:r>
       <w:r>
         <w:rPr>
-          <w:rStyle w:val="VerbatimChar"/>
+          <w:rStyle w:val="CommentTok"/>
         </w:rPr>
         <w:t xml:space="preserve">#&gt; Distributions of antigen-isotype measurements:</w:t>
       </w:r>
@@ -880,7 +1369,7 @@
       </w:r>
       <w:r>
         <w:rPr>
-          <w:rStyle w:val="VerbatimChar"/>
+          <w:rStyle w:val="CommentTok"/>
         </w:rPr>
         <w:t xml:space="preserve">#&gt; </w:t>
       </w:r>
@@ -889,7 +1378,7 @@
       </w:r>
       <w:r>
         <w:rPr>
-          <w:rStyle w:val="VerbatimChar"/>
+          <w:rStyle w:val="CommentTok"/>
         </w:rPr>
         <w:t xml:space="preserve">#&gt; # A tibble: 4 × 8</w:t>
       </w:r>
@@ -898,7 +1387,7 @@
       </w:r>
       <w:r>
         <w:rPr>
-          <w:rStyle w:val="VerbatimChar"/>
+          <w:rStyle w:val="CommentTok"/>
         </w:rPr>
         <w:t xml:space="preserve">#&gt;   antigen_iso country     Min `1st Qu.` Median `3rd Qu.`     Max `# NAs`</w:t>
       </w:r>
@@ -907,7 +1396,7 @@
       </w:r>
       <w:r>
         <w:rPr>
-          <w:rStyle w:val="VerbatimChar"/>
+          <w:rStyle w:val="CommentTok"/>
         </w:rPr>
         <w:t xml:space="preserve">#&gt;   &lt;fct&gt;       &lt;fct&gt;     &lt;dbl&gt;     &lt;dbl&gt;  &lt;dbl&gt;     &lt;dbl&gt;   &lt;dbl&gt;   &lt;int&gt;</w:t>
       </w:r>
@@ -916,7 +1405,7 @@
       </w:r>
       <w:r>
         <w:rPr>
-          <w:rStyle w:val="VerbatimChar"/>
+          <w:rStyle w:val="CommentTok"/>
         </w:rPr>
         <w:t xml:space="preserve">#&gt; 1 OT56kda_IgG India     0.05      0.111  0.222     2.56     3.81       0</w:t>
       </w:r>
@@ -925,7 +1414,7 @@
       </w:r>
       <w:r>
         <w:rPr>
-          <w:rStyle w:val="VerbatimChar"/>
+          <w:rStyle w:val="CommentTok"/>
         </w:rPr>
         <w:t xml:space="preserve">#&gt; 2 OT56kda_IgM India     0.051     0.1    0.139     0.229    3.60       0</w:t>
       </w:r>
@@ -934,7 +1423,7 @@
       </w:r>
       <w:r>
         <w:rPr>
-          <w:rStyle w:val="VerbatimChar"/>
+          <w:rStyle w:val="CommentTok"/>
         </w:rPr>
         <w:t xml:space="preserve">#&gt; 3 OT56kda_IgG Nepal     0.112     0.335  0.464     0.602    3.29       0</w:t>
       </w:r>
@@ -943,7 +1432,7 @@
       </w:r>
       <w:r>
         <w:rPr>
-          <w:rStyle w:val="VerbatimChar"/>
+          <w:rStyle w:val="CommentTok"/>
         </w:rPr>
         <w:t xml:space="preserve">#&gt; 4 OT56kda_IgM Nepal   Inf        NA     NA        NA     -Inf       1105</w:t>
       </w:r>
@@ -972,7 +1461,91 @@
       </w:pPr>
       <w:r>
         <w:rPr>
-          <w:rStyle w:val="VerbatimChar"/>
+          <w:rStyle w:val="CommentTok"/>
+        </w:rPr>
+        <w:t xml:space="preserve"># Plot antibody responses by age</w:t>
+      </w:r>
+      <w:r>
+        <w:br/>
+      </w:r>
+      <w:r>
+        <w:rPr>
+          <w:rStyle w:val="FunctionTok"/>
+        </w:rPr>
+        <w:t xml:space="preserve">autoplot</w:t>
+      </w:r>
+      <w:r>
+        <w:rPr>
+          <w:rStyle w:val="NormalTok"/>
+        </w:rPr>
+        <w:t xml:space="preserve">(</w:t>
+      </w:r>
+      <w:r>
+        <w:rPr>
+          <w:rStyle w:val="AttributeTok"/>
+        </w:rPr>
+        <w:t xml:space="preserve">object =</w:t>
+      </w:r>
+      <w:r>
+        <w:rPr>
+          <w:rStyle w:val="NormalTok"/>
+        </w:rPr>
+        <w:t xml:space="preserve"> xs_data, </w:t>
+      </w:r>
+      <w:r>
+        <w:rPr>
+          <w:rStyle w:val="AttributeTok"/>
+        </w:rPr>
+        <w:t xml:space="preserve">type =</w:t>
+      </w:r>
+      <w:r>
+        <w:rPr>
+          <w:rStyle w:val="NormalTok"/>
+        </w:rPr>
+        <w:t xml:space="preserve"> </w:t>
+      </w:r>
+      <w:r>
+        <w:rPr>
+          <w:rStyle w:val="StringTok"/>
+        </w:rPr>
+        <w:t xml:space="preserve">"age-scatter"</w:t>
+      </w:r>
+      <w:r>
+        <w:rPr>
+          <w:rStyle w:val="NormalTok"/>
+        </w:rPr>
+        <w:t xml:space="preserve">, </w:t>
+      </w:r>
+      <w:r>
+        <w:rPr>
+          <w:rStyle w:val="AttributeTok"/>
+        </w:rPr>
+        <w:t xml:space="preserve">strata =</w:t>
+      </w:r>
+      <w:r>
+        <w:rPr>
+          <w:rStyle w:val="NormalTok"/>
+        </w:rPr>
+        <w:t xml:space="preserve"> </w:t>
+      </w:r>
+      <w:r>
+        <w:rPr>
+          <w:rStyle w:val="StringTok"/>
+        </w:rPr>
+        <w:t xml:space="preserve">"country"</w:t>
+      </w:r>
+      <w:r>
+        <w:rPr>
+          <w:rStyle w:val="NormalTok"/>
+        </w:rPr>
+        <w:t xml:space="preserve">)</w:t>
+      </w:r>
+      <w:r>
+        <w:br/>
+      </w:r>
+      <w:r>
+        <w:rPr>
+          <w:rStyle w:val="CommentTok"/>
         </w:rPr>
         <w:t xml:space="preserve">#&gt; Warning: Removed 1105 rows containing missing values or values outside the scale range</w:t>
       </w:r>
@@ -981,7 +1554,7 @@
       </w:r>
       <w:r>
         <w:rPr>
-          <w:rStyle w:val="VerbatimChar"/>
+          <w:rStyle w:val="CommentTok"/>
         </w:rPr>
         <w:t xml:space="preserve">#&gt; (`geom_point()`).</w:t>
       </w:r>
@@ -1267,7 +1840,670 @@
       </w:pPr>
       <w:r>
         <w:rPr>
-          <w:rStyle w:val="VerbatimChar"/>
+          <w:rStyle w:val="CommentTok"/>
+        </w:rPr>
+        <w:t xml:space="preserve"># biologic noise</w:t>
+      </w:r>
+      <w:r>
+        <w:br/>
+      </w:r>
+      <w:r>
+        <w:rPr>
+          <w:rStyle w:val="NormalTok"/>
+        </w:rPr>
+        <w:t xml:space="preserve">b_noise </w:t>
+      </w:r>
+      <w:r>
+        <w:rPr>
+          <w:rStyle w:val="OtherTok"/>
+        </w:rPr>
+        <w:t xml:space="preserve">&lt;-</w:t>
+      </w:r>
+      <w:r>
+        <w:rPr>
+          <w:rStyle w:val="NormalTok"/>
+        </w:rPr>
+        <w:t xml:space="preserve"> xs_data </w:t>
+      </w:r>
+      <w:r>
+        <w:rPr>
+          <w:rStyle w:val="SpecialCharTok"/>
+        </w:rPr>
+        <w:t xml:space="preserve">|&gt;</w:t>
+      </w:r>
+      <w:r>
+        <w:br/>
+      </w:r>
+      <w:r>
+        <w:rPr>
+          <w:rStyle w:val="NormalTok"/>
+        </w:rPr>
+        <w:t xml:space="preserve">  </w:t>
+      </w:r>
+      <w:r>
+        <w:rPr>
+          <w:rStyle w:val="FunctionTok"/>
+        </w:rPr>
+        <w:t xml:space="preserve">group_by</w:t>
+      </w:r>
+      <w:r>
+        <w:rPr>
+          <w:rStyle w:val="NormalTok"/>
+        </w:rPr>
+        <w:t xml:space="preserve">(antigen_iso) </w:t>
+      </w:r>
+      <w:r>
+        <w:rPr>
+          <w:rStyle w:val="SpecialCharTok"/>
+        </w:rPr>
+        <w:t xml:space="preserve">|&gt;</w:t>
+      </w:r>
+      <w:r>
+        <w:br/>
+      </w:r>
+      <w:r>
+        <w:rPr>
+          <w:rStyle w:val="NormalTok"/>
+        </w:rPr>
+        <w:t xml:space="preserve">  </w:t>
+      </w:r>
+      <w:r>
+        <w:rPr>
+          <w:rStyle w:val="FunctionTok"/>
+        </w:rPr>
+        <w:t xml:space="preserve">filter</w:t>
+      </w:r>
+      <w:r>
+        <w:rPr>
+          <w:rStyle w:val="NormalTok"/>
+        </w:rPr>
+        <w:t xml:space="preserve">(</w:t>
+      </w:r>
+      <w:r>
+        <w:rPr>
+          <w:rStyle w:val="SpecialCharTok"/>
+        </w:rPr>
+        <w:t xml:space="preserve">!</w:t>
+      </w:r>
+      <w:r>
+        <w:rPr>
+          <w:rStyle w:val="FunctionTok"/>
+        </w:rPr>
+        <w:t xml:space="preserve">is.na</w:t>
+      </w:r>
+      <w:r>
+        <w:rPr>
+          <w:rStyle w:val="NormalTok"/>
+        </w:rPr>
+        <w:t xml:space="preserve">(value)) </w:t>
+      </w:r>
+      <w:r>
+        <w:rPr>
+          <w:rStyle w:val="SpecialCharTok"/>
+        </w:rPr>
+        <w:t xml:space="preserve">|&gt;</w:t>
+      </w:r>
+      <w:r>
+        <w:br/>
+      </w:r>
+      <w:r>
+        <w:rPr>
+          <w:rStyle w:val="NormalTok"/>
+        </w:rPr>
+        <w:t xml:space="preserve">  </w:t>
+      </w:r>
+      <w:r>
+        <w:rPr>
+          <w:rStyle w:val="FunctionTok"/>
+        </w:rPr>
+        <w:t xml:space="preserve">filter</w:t>
+      </w:r>
+      <w:r>
+        <w:rPr>
+          <w:rStyle w:val="NormalTok"/>
+        </w:rPr>
+        <w:t xml:space="preserve">(age </w:t>
+      </w:r>
+      <w:r>
+        <w:rPr>
+          <w:rStyle w:val="SpecialCharTok"/>
+        </w:rPr>
+        <w:t xml:space="preserve">&lt;</w:t>
+      </w:r>
+      <w:r>
+        <w:rPr>
+          <w:rStyle w:val="NormalTok"/>
+        </w:rPr>
+        <w:t xml:space="preserve"> </w:t>
+      </w:r>
+      <w:r>
+        <w:rPr>
+          <w:rStyle w:val="DecValTok"/>
+        </w:rPr>
+        <w:t xml:space="preserve">40</w:t>
+      </w:r>
+      <w:r>
+        <w:rPr>
+          <w:rStyle w:val="NormalTok"/>
+        </w:rPr>
+        <w:t xml:space="preserve">) </w:t>
+      </w:r>
+      <w:r>
+        <w:rPr>
+          <w:rStyle w:val="SpecialCharTok"/>
+        </w:rPr>
+        <w:t xml:space="preserve">|&gt;</w:t>
+      </w:r>
+      <w:r>
+        <w:rPr>
+          <w:rStyle w:val="NormalTok"/>
+        </w:rPr>
+        <w:t xml:space="preserve"> </w:t>
+      </w:r>
+      <w:r>
+        <w:rPr>
+          <w:rStyle w:val="CommentTok"/>
+        </w:rPr>
+        <w:t xml:space="preserve"># restrict to young ages to capture recent exposures</w:t>
+      </w:r>
+      <w:r>
+        <w:br/>
+      </w:r>
+      <w:r>
+        <w:rPr>
+          <w:rStyle w:val="NormalTok"/>
+        </w:rPr>
+        <w:t xml:space="preserve">  </w:t>
+      </w:r>
+      <w:r>
+        <w:rPr>
+          <w:rStyle w:val="FunctionTok"/>
+        </w:rPr>
+        <w:t xml:space="preserve">do</w:t>
+      </w:r>
+      <w:r>
+        <w:rPr>
+          <w:rStyle w:val="NormalTok"/>
+        </w:rPr>
+        <w:t xml:space="preserve">({</w:t>
+      </w:r>
+      <w:r>
+        <w:br/>
+      </w:r>
+      <w:r>
+        <w:rPr>
+          <w:rStyle w:val="NormalTok"/>
+        </w:rPr>
+        <w:t xml:space="preserve">    </w:t>
+      </w:r>
+      <w:r>
+        <w:rPr>
+          <w:rStyle w:val="FunctionTok"/>
+        </w:rPr>
+        <w:t xml:space="preserve">set.seed</w:t>
+      </w:r>
+      <w:r>
+        <w:rPr>
+          <w:rStyle w:val="NormalTok"/>
+        </w:rPr>
+        <w:t xml:space="preserve">(</w:t>
+      </w:r>
+      <w:r>
+        <w:rPr>
+          <w:rStyle w:val="DecValTok"/>
+        </w:rPr>
+        <w:t xml:space="preserve">54321</w:t>
+      </w:r>
+      <w:r>
+        <w:rPr>
+          <w:rStyle w:val="NormalTok"/>
+        </w:rPr>
+        <w:t xml:space="preserve">)</w:t>
+      </w:r>
+      <w:r>
+        <w:br/>
+      </w:r>
+      <w:r>
+        <w:rPr>
+          <w:rStyle w:val="NormalTok"/>
+        </w:rPr>
+        <w:t xml:space="preserve">    </w:t>
+      </w:r>
+      <w:r>
+        <w:rPr>
+          <w:rStyle w:val="CommentTok"/>
+        </w:rPr>
+        <w:t xml:space="preserve"># Fit the mixture model</w:t>
+      </w:r>
+      <w:r>
+        <w:br/>
+      </w:r>
+      <w:r>
+        <w:rPr>
+          <w:rStyle w:val="NormalTok"/>
+        </w:rPr>
+        <w:t xml:space="preserve">    mixmod </w:t>
+      </w:r>
+      <w:r>
+        <w:rPr>
+          <w:rStyle w:val="OtherTok"/>
+        </w:rPr>
+        <w:t xml:space="preserve">&lt;-</w:t>
+      </w:r>
+      <w:r>
+        <w:rPr>
+          <w:rStyle w:val="NormalTok"/>
+        </w:rPr>
+        <w:t xml:space="preserve"> </w:t>
+      </w:r>
+      <w:r>
+        <w:rPr>
+          <w:rStyle w:val="FunctionTok"/>
+        </w:rPr>
+        <w:t xml:space="preserve">normalmixEM</w:t>
+      </w:r>
+      <w:r>
+        <w:rPr>
+          <w:rStyle w:val="NormalTok"/>
+        </w:rPr>
+        <w:t xml:space="preserve">(.</w:t>
+      </w:r>
+      <w:r>
+        <w:rPr>
+          <w:rStyle w:val="SpecialCharTok"/>
+        </w:rPr>
+        <w:t xml:space="preserve">$</w:t>
+      </w:r>
+      <w:r>
+        <w:rPr>
+          <w:rStyle w:val="NormalTok"/>
+        </w:rPr>
+        <w:t xml:space="preserve">value, </w:t>
+      </w:r>
+      <w:r>
+        <w:rPr>
+          <w:rStyle w:val="AttributeTok"/>
+        </w:rPr>
+        <w:t xml:space="preserve">k =</w:t>
+      </w:r>
+      <w:r>
+        <w:rPr>
+          <w:rStyle w:val="NormalTok"/>
+        </w:rPr>
+        <w:t xml:space="preserve"> </w:t>
+      </w:r>
+      <w:r>
+        <w:rPr>
+          <w:rStyle w:val="DecValTok"/>
+        </w:rPr>
+        <w:t xml:space="preserve">2</w:t>
+      </w:r>
+      <w:r>
+        <w:rPr>
+          <w:rStyle w:val="NormalTok"/>
+        </w:rPr>
+        <w:t xml:space="preserve">, </w:t>
+      </w:r>
+      <w:r>
+        <w:rPr>
+          <w:rStyle w:val="AttributeTok"/>
+        </w:rPr>
+        <w:t xml:space="preserve">maxit =</w:t>
+      </w:r>
+      <w:r>
+        <w:rPr>
+          <w:rStyle w:val="NormalTok"/>
+        </w:rPr>
+        <w:t xml:space="preserve"> </w:t>
+      </w:r>
+      <w:r>
+        <w:rPr>
+          <w:rStyle w:val="DecValTok"/>
+        </w:rPr>
+        <w:t xml:space="preserve">1000</w:t>
+      </w:r>
+      <w:r>
+        <w:rPr>
+          <w:rStyle w:val="NormalTok"/>
+        </w:rPr>
+        <w:t xml:space="preserve">)</w:t>
+      </w:r>
+      <w:r>
+        <w:br/>
+      </w:r>
+      <w:r>
+        <w:rPr>
+          <w:rStyle w:val="NormalTok"/>
+        </w:rPr>
+        <w:t xml:space="preserve">    </w:t>
+      </w:r>
+      <w:r>
+        <w:rPr>
+          <w:rStyle w:val="CommentTok"/>
+        </w:rPr>
+        <w:t xml:space="preserve"># k is the number of components, adjust as necessary</w:t>
+      </w:r>
+      <w:r>
+        <w:br/>
+      </w:r>
+      <w:r>
+        <w:rPr>
+          <w:rStyle w:val="NormalTok"/>
+        </w:rPr>
+        <w:t xml:space="preserve">    </w:t>
+      </w:r>
+      <w:r>
+        <w:rPr>
+          <w:rStyle w:val="CommentTok"/>
+        </w:rPr>
+        <w:t xml:space="preserve"># Assuming the first component is the lower distribution:</w:t>
+      </w:r>
+      <w:r>
+        <w:br/>
+      </w:r>
+      <w:r>
+        <w:rPr>
+          <w:rStyle w:val="NormalTok"/>
+        </w:rPr>
+        <w:t xml:space="preserve">    lower_mu </w:t>
+      </w:r>
+      <w:r>
+        <w:rPr>
+          <w:rStyle w:val="OtherTok"/>
+        </w:rPr>
+        <w:t xml:space="preserve">&lt;-</w:t>
+      </w:r>
+      <w:r>
+        <w:rPr>
+          <w:rStyle w:val="NormalTok"/>
+        </w:rPr>
+        <w:t xml:space="preserve"> mixmod</w:t>
+      </w:r>
+      <w:r>
+        <w:rPr>
+          <w:rStyle w:val="SpecialCharTok"/>
+        </w:rPr>
+        <w:t xml:space="preserve">$</w:t>
+      </w:r>
+      <w:r>
+        <w:rPr>
+          <w:rStyle w:val="NormalTok"/>
+        </w:rPr>
+        <w:t xml:space="preserve">mu[</w:t>
+      </w:r>
+      <w:r>
+        <w:rPr>
+          <w:rStyle w:val="DecValTok"/>
+        </w:rPr>
+        <w:t xml:space="preserve">1</w:t>
+      </w:r>
+      <w:r>
+        <w:rPr>
+          <w:rStyle w:val="NormalTok"/>
+        </w:rPr>
+        <w:t xml:space="preserve">]</w:t>
+      </w:r>
+      <w:r>
+        <w:br/>
+      </w:r>
+      <w:r>
+        <w:rPr>
+          <w:rStyle w:val="NormalTok"/>
+        </w:rPr>
+        <w:t xml:space="preserve">    lower_sigma </w:t>
+      </w:r>
+      <w:r>
+        <w:rPr>
+          <w:rStyle w:val="OtherTok"/>
+        </w:rPr>
+        <w:t xml:space="preserve">&lt;-</w:t>
+      </w:r>
+      <w:r>
+        <w:rPr>
+          <w:rStyle w:val="NormalTok"/>
+        </w:rPr>
+        <w:t xml:space="preserve"> </w:t>
+      </w:r>
+      <w:r>
+        <w:rPr>
+          <w:rStyle w:val="FunctionTok"/>
+        </w:rPr>
+        <w:t xml:space="preserve">sqrt</w:t>
+      </w:r>
+      <w:r>
+        <w:rPr>
+          <w:rStyle w:val="NormalTok"/>
+        </w:rPr>
+        <w:t xml:space="preserve">(mixmod</w:t>
+      </w:r>
+      <w:r>
+        <w:rPr>
+          <w:rStyle w:val="SpecialCharTok"/>
+        </w:rPr>
+        <w:t xml:space="preserve">$</w:t>
+      </w:r>
+      <w:r>
+        <w:rPr>
+          <w:rStyle w:val="NormalTok"/>
+        </w:rPr>
+        <w:t xml:space="preserve">sigma[</w:t>
+      </w:r>
+      <w:r>
+        <w:rPr>
+          <w:rStyle w:val="DecValTok"/>
+        </w:rPr>
+        <w:t xml:space="preserve">1</w:t>
+      </w:r>
+      <w:r>
+        <w:rPr>
+          <w:rStyle w:val="NormalTok"/>
+        </w:rPr>
+        <w:t xml:space="preserve">])</w:t>
+      </w:r>
+      <w:r>
+        <w:br/>
+      </w:r>
+      <w:r>
+        <w:rPr>
+          <w:rStyle w:val="NormalTok"/>
+        </w:rPr>
+        <w:t xml:space="preserve">    </w:t>
+      </w:r>
+      <w:r>
+        <w:rPr>
+          <w:rStyle w:val="CommentTok"/>
+        </w:rPr>
+        <w:t xml:space="preserve"># Calculate the 90th percentile of the lower distribution</w:t>
+      </w:r>
+      <w:r>
+        <w:br/>
+      </w:r>
+      <w:r>
+        <w:rPr>
+          <w:rStyle w:val="NormalTok"/>
+        </w:rPr>
+        <w:t xml:space="preserve">    percentile75 </w:t>
+      </w:r>
+      <w:r>
+        <w:rPr>
+          <w:rStyle w:val="OtherTok"/>
+        </w:rPr>
+        <w:t xml:space="preserve">&lt;-</w:t>
+      </w:r>
+      <w:r>
+        <w:rPr>
+          <w:rStyle w:val="NormalTok"/>
+        </w:rPr>
+        <w:t xml:space="preserve"> </w:t>
+      </w:r>
+      <w:r>
+        <w:rPr>
+          <w:rStyle w:val="FunctionTok"/>
+        </w:rPr>
+        <w:t xml:space="preserve">qnorm</w:t>
+      </w:r>
+      <w:r>
+        <w:rPr>
+          <w:rStyle w:val="NormalTok"/>
+        </w:rPr>
+        <w:t xml:space="preserve">(</w:t>
+      </w:r>
+      <w:r>
+        <w:br/>
+      </w:r>
+      <w:r>
+        <w:rPr>
+          <w:rStyle w:val="NormalTok"/>
+        </w:rPr>
+        <w:t xml:space="preserve">      </w:t>
+      </w:r>
+      <w:r>
+        <w:rPr>
+          <w:rStyle w:val="FloatTok"/>
+        </w:rPr>
+        <w:t xml:space="preserve">0.75</w:t>
+      </w:r>
+      <w:r>
+        <w:rPr>
+          <w:rStyle w:val="NormalTok"/>
+        </w:rPr>
+        <w:t xml:space="preserve">,</w:t>
+      </w:r>
+      <w:r>
+        <w:br/>
+      </w:r>
+      <w:r>
+        <w:rPr>
+          <w:rStyle w:val="NormalTok"/>
+        </w:rPr>
+        <w:t xml:space="preserve">      lower_mu,</w:t>
+      </w:r>
+      <w:r>
+        <w:br/>
+      </w:r>
+      <w:r>
+        <w:rPr>
+          <w:rStyle w:val="NormalTok"/>
+        </w:rPr>
+        <w:t xml:space="preserve">      lower_sigma</w:t>
+      </w:r>
+      <w:r>
+        <w:br/>
+      </w:r>
+      <w:r>
+        <w:rPr>
+          <w:rStyle w:val="NormalTok"/>
+        </w:rPr>
+        <w:t xml:space="preserve">    )</w:t>
+      </w:r>
+      <w:r>
+        <w:br/>
+      </w:r>
+      <w:r>
+        <w:rPr>
+          <w:rStyle w:val="NormalTok"/>
+        </w:rPr>
+        <w:t xml:space="preserve">    </w:t>
+      </w:r>
+      <w:r>
+        <w:rPr>
+          <w:rStyle w:val="CommentTok"/>
+        </w:rPr>
+        <w:t xml:space="preserve"># Return the results</w:t>
+      </w:r>
+      <w:r>
+        <w:br/>
+      </w:r>
+      <w:r>
+        <w:rPr>
+          <w:rStyle w:val="NormalTok"/>
+        </w:rPr>
+        <w:t xml:space="preserve">    </w:t>
+      </w:r>
+      <w:r>
+        <w:rPr>
+          <w:rStyle w:val="FunctionTok"/>
+        </w:rPr>
+        <w:t xml:space="preserve">data.frame</w:t>
+      </w:r>
+      <w:r>
+        <w:rPr>
+          <w:rStyle w:val="NormalTok"/>
+        </w:rPr>
+        <w:t xml:space="preserve">(</w:t>
+      </w:r>
+      <w:r>
+        <w:rPr>
+          <w:rStyle w:val="AttributeTok"/>
+        </w:rPr>
+        <w:t xml:space="preserve">antigen_iso =</w:t>
+      </w:r>
+      <w:r>
+        <w:rPr>
+          <w:rStyle w:val="NormalTok"/>
+        </w:rPr>
+        <w:t xml:space="preserve"> .</w:t>
+      </w:r>
+      <w:r>
+        <w:rPr>
+          <w:rStyle w:val="SpecialCharTok"/>
+        </w:rPr>
+        <w:t xml:space="preserve">$</w:t>
+      </w:r>
+      <w:r>
+        <w:rPr>
+          <w:rStyle w:val="NormalTok"/>
+        </w:rPr>
+        <w:t xml:space="preserve">antigen_iso[</w:t>
+      </w:r>
+      <w:r>
+        <w:rPr>
+          <w:rStyle w:val="DecValTok"/>
+        </w:rPr>
+        <w:t xml:space="preserve">1</w:t>
+      </w:r>
+      <w:r>
+        <w:rPr>
+          <w:rStyle w:val="NormalTok"/>
+        </w:rPr>
+        <w:t xml:space="preserve">],</w:t>
+      </w:r>
+      <w:r>
+        <w:br/>
+      </w:r>
+      <w:r>
+        <w:rPr>
+          <w:rStyle w:val="NormalTok"/>
+        </w:rPr>
+        <w:t xml:space="preserve">               </w:t>
+      </w:r>
+      <w:r>
+        <w:rPr>
+          <w:rStyle w:val="AttributeTok"/>
+        </w:rPr>
+        <w:t xml:space="preserve">percentile75 =</w:t>
+      </w:r>
+      <w:r>
+        <w:rPr>
+          <w:rStyle w:val="NormalTok"/>
+        </w:rPr>
+        <w:t xml:space="preserve"> percentile75)</w:t>
+      </w:r>
+      <w:r>
+        <w:br/>
+      </w:r>
+      <w:r>
+        <w:rPr>
+          <w:rStyle w:val="NormalTok"/>
+        </w:rPr>
+        <w:t xml:space="preserve">  })</w:t>
+      </w:r>
+      <w:r>
+        <w:br/>
+      </w:r>
+      <w:r>
+        <w:rPr>
+          <w:rStyle w:val="CommentTok"/>
         </w:rPr>
         <w:t xml:space="preserve">#&gt; number of iterations= 35 </w:t>
       </w:r>
@@ -1276,9 +2512,495 @@
       </w:r>
       <w:r>
         <w:rPr>
-          <w:rStyle w:val="VerbatimChar"/>
+          <w:rStyle w:val="CommentTok"/>
         </w:rPr>
         <w:t xml:space="preserve">#&gt; number of iterations= 24</w:t>
+      </w:r>
+      <w:r>
+        <w:br/>
+      </w:r>
+      <w:r>
+        <w:br/>
+      </w:r>
+      <w:r>
+        <w:br/>
+      </w:r>
+      <w:r>
+        <w:br/>
+      </w:r>
+      <w:r>
+        <w:rPr>
+          <w:rStyle w:val="CommentTok"/>
+        </w:rPr>
+        <w:t xml:space="preserve"># define conditional parameters</w:t>
+      </w:r>
+      <w:r>
+        <w:br/>
+      </w:r>
+      <w:r>
+        <w:rPr>
+          <w:rStyle w:val="NormalTok"/>
+        </w:rPr>
+        <w:t xml:space="preserve">noise </w:t>
+      </w:r>
+      <w:r>
+        <w:rPr>
+          <w:rStyle w:val="OtherTok"/>
+        </w:rPr>
+        <w:t xml:space="preserve">&lt;-</w:t>
+      </w:r>
+      <w:r>
+        <w:rPr>
+          <w:rStyle w:val="NormalTok"/>
+        </w:rPr>
+        <w:t xml:space="preserve"> </w:t>
+      </w:r>
+      <w:r>
+        <w:rPr>
+          <w:rStyle w:val="FunctionTok"/>
+        </w:rPr>
+        <w:t xml:space="preserve">data.frame</w:t>
+      </w:r>
+      <w:r>
+        <w:rPr>
+          <w:rStyle w:val="NormalTok"/>
+        </w:rPr>
+        <w:t xml:space="preserve">(</w:t>
+      </w:r>
+      <w:r>
+        <w:br/>
+      </w:r>
+      <w:r>
+        <w:rPr>
+          <w:rStyle w:val="NormalTok"/>
+        </w:rPr>
+        <w:t xml:space="preserve">  </w:t>
+      </w:r>
+      <w:r>
+        <w:rPr>
+          <w:rStyle w:val="AttributeTok"/>
+        </w:rPr>
+        <w:t xml:space="preserve">antigen_iso =</w:t>
+      </w:r>
+      <w:r>
+        <w:rPr>
+          <w:rStyle w:val="NormalTok"/>
+        </w:rPr>
+        <w:t xml:space="preserve"> </w:t>
+      </w:r>
+      <w:r>
+        <w:rPr>
+          <w:rStyle w:val="FunctionTok"/>
+        </w:rPr>
+        <w:t xml:space="preserve">c</w:t>
+      </w:r>
+      <w:r>
+        <w:rPr>
+          <w:rStyle w:val="NormalTok"/>
+        </w:rPr>
+        <w:t xml:space="preserve">(</w:t>
+      </w:r>
+      <w:r>
+        <w:rPr>
+          <w:rStyle w:val="StringTok"/>
+        </w:rPr>
+        <w:t xml:space="preserve">"OT56kda_IgG"</w:t>
+      </w:r>
+      <w:r>
+        <w:rPr>
+          <w:rStyle w:val="NormalTok"/>
+        </w:rPr>
+        <w:t xml:space="preserve">, </w:t>
+      </w:r>
+      <w:r>
+        <w:rPr>
+          <w:rStyle w:val="StringTok"/>
+        </w:rPr>
+        <w:t xml:space="preserve">"OT56kda_IgM"</w:t>
+      </w:r>
+      <w:r>
+        <w:rPr>
+          <w:rStyle w:val="NormalTok"/>
+        </w:rPr>
+        <w:t xml:space="preserve">),</w:t>
+      </w:r>
+      <w:r>
+        <w:br/>
+      </w:r>
+      <w:r>
+        <w:rPr>
+          <w:rStyle w:val="NormalTok"/>
+        </w:rPr>
+        <w:t xml:space="preserve">  </w:t>
+      </w:r>
+      <w:r>
+        <w:rPr>
+          <w:rStyle w:val="AttributeTok"/>
+        </w:rPr>
+        <w:t xml:space="preserve">nu =</w:t>
+      </w:r>
+      <w:r>
+        <w:rPr>
+          <w:rStyle w:val="NormalTok"/>
+        </w:rPr>
+        <w:t xml:space="preserve"> </w:t>
+      </w:r>
+      <w:r>
+        <w:rPr>
+          <w:rStyle w:val="FunctionTok"/>
+        </w:rPr>
+        <w:t xml:space="preserve">as.numeric</w:t>
+      </w:r>
+      <w:r>
+        <w:rPr>
+          <w:rStyle w:val="NormalTok"/>
+        </w:rPr>
+        <w:t xml:space="preserve">(</w:t>
+      </w:r>
+      <w:r>
+        <w:rPr>
+          <w:rStyle w:val="FunctionTok"/>
+        </w:rPr>
+        <w:t xml:space="preserve">c</w:t>
+      </w:r>
+      <w:r>
+        <w:rPr>
+          <w:rStyle w:val="NormalTok"/>
+        </w:rPr>
+        <w:t xml:space="preserve">(b_noise[</w:t>
+      </w:r>
+      <w:r>
+        <w:rPr>
+          <w:rStyle w:val="DecValTok"/>
+        </w:rPr>
+        <w:t xml:space="preserve">2</w:t>
+      </w:r>
+      <w:r>
+        <w:rPr>
+          <w:rStyle w:val="NormalTok"/>
+        </w:rPr>
+        <w:t xml:space="preserve">, </w:t>
+      </w:r>
+      <w:r>
+        <w:rPr>
+          <w:rStyle w:val="DecValTok"/>
+        </w:rPr>
+        <w:t xml:space="preserve">2</w:t>
+      </w:r>
+      <w:r>
+        <w:rPr>
+          <w:rStyle w:val="NormalTok"/>
+        </w:rPr>
+        <w:t xml:space="preserve">], b_noise[</w:t>
+      </w:r>
+      <w:r>
+        <w:rPr>
+          <w:rStyle w:val="DecValTok"/>
+        </w:rPr>
+        <w:t xml:space="preserve">1</w:t>
+      </w:r>
+      <w:r>
+        <w:rPr>
+          <w:rStyle w:val="NormalTok"/>
+        </w:rPr>
+        <w:t xml:space="preserve">, </w:t>
+      </w:r>
+      <w:r>
+        <w:rPr>
+          <w:rStyle w:val="DecValTok"/>
+        </w:rPr>
+        <w:t xml:space="preserve">2</w:t>
+      </w:r>
+      <w:r>
+        <w:rPr>
+          <w:rStyle w:val="NormalTok"/>
+        </w:rPr>
+        <w:t xml:space="preserve">])), </w:t>
+      </w:r>
+      <w:r>
+        <w:rPr>
+          <w:rStyle w:val="CommentTok"/>
+        </w:rPr>
+        <w:t xml:space="preserve"># Biologic noise (nu)</w:t>
+      </w:r>
+      <w:r>
+        <w:br/>
+      </w:r>
+      <w:r>
+        <w:rPr>
+          <w:rStyle w:val="NormalTok"/>
+        </w:rPr>
+        <w:t xml:space="preserve">  </w:t>
+      </w:r>
+      <w:r>
+        <w:rPr>
+          <w:rStyle w:val="AttributeTok"/>
+        </w:rPr>
+        <w:t xml:space="preserve">eps =</w:t>
+      </w:r>
+      <w:r>
+        <w:rPr>
+          <w:rStyle w:val="NormalTok"/>
+        </w:rPr>
+        <w:t xml:space="preserve"> </w:t>
+      </w:r>
+      <w:r>
+        <w:rPr>
+          <w:rStyle w:val="FunctionTok"/>
+        </w:rPr>
+        <w:t xml:space="preserve">c</w:t>
+      </w:r>
+      <w:r>
+        <w:rPr>
+          <w:rStyle w:val="NormalTok"/>
+        </w:rPr>
+        <w:t xml:space="preserve">(</w:t>
+      </w:r>
+      <w:r>
+        <w:rPr>
+          <w:rStyle w:val="FloatTok"/>
+        </w:rPr>
+        <w:t xml:space="preserve">0.2</w:t>
+      </w:r>
+      <w:r>
+        <w:rPr>
+          <w:rStyle w:val="NormalTok"/>
+        </w:rPr>
+        <w:t xml:space="preserve">, </w:t>
+      </w:r>
+      <w:r>
+        <w:rPr>
+          <w:rStyle w:val="FloatTok"/>
+        </w:rPr>
+        <w:t xml:space="preserve">0.2</w:t>
+      </w:r>
+      <w:r>
+        <w:rPr>
+          <w:rStyle w:val="NormalTok"/>
+        </w:rPr>
+        <w:t xml:space="preserve">), </w:t>
+      </w:r>
+      <w:r>
+        <w:rPr>
+          <w:rStyle w:val="CommentTok"/>
+        </w:rPr>
+        <w:t xml:space="preserve"># M noise (eps)</w:t>
+      </w:r>
+      <w:r>
+        <w:br/>
+      </w:r>
+      <w:r>
+        <w:rPr>
+          <w:rStyle w:val="NormalTok"/>
+        </w:rPr>
+        <w:t xml:space="preserve">  </w:t>
+      </w:r>
+      <w:r>
+        <w:rPr>
+          <w:rStyle w:val="AttributeTok"/>
+        </w:rPr>
+        <w:t xml:space="preserve">y.low =</w:t>
+      </w:r>
+      <w:r>
+        <w:rPr>
+          <w:rStyle w:val="NormalTok"/>
+        </w:rPr>
+        <w:t xml:space="preserve"> </w:t>
+      </w:r>
+      <w:r>
+        <w:rPr>
+          <w:rStyle w:val="FunctionTok"/>
+        </w:rPr>
+        <w:t xml:space="preserve">c</w:t>
+      </w:r>
+      <w:r>
+        <w:rPr>
+          <w:rStyle w:val="NormalTok"/>
+        </w:rPr>
+        <w:t xml:space="preserve">(</w:t>
+      </w:r>
+      <w:r>
+        <w:rPr>
+          <w:rStyle w:val="FloatTok"/>
+        </w:rPr>
+        <w:t xml:space="preserve">0.2</w:t>
+      </w:r>
+      <w:r>
+        <w:rPr>
+          <w:rStyle w:val="NormalTok"/>
+        </w:rPr>
+        <w:t xml:space="preserve">, </w:t>
+      </w:r>
+      <w:r>
+        <w:rPr>
+          <w:rStyle w:val="FloatTok"/>
+        </w:rPr>
+        <w:t xml:space="preserve">0.2</w:t>
+      </w:r>
+      <w:r>
+        <w:rPr>
+          <w:rStyle w:val="NormalTok"/>
+        </w:rPr>
+        <w:t xml:space="preserve">), </w:t>
+      </w:r>
+      <w:r>
+        <w:rPr>
+          <w:rStyle w:val="CommentTok"/>
+        </w:rPr>
+        <w:t xml:space="preserve"># low cutoff (llod)</w:t>
+      </w:r>
+      <w:r>
+        <w:br/>
+      </w:r>
+      <w:r>
+        <w:rPr>
+          <w:rStyle w:val="NormalTok"/>
+        </w:rPr>
+        <w:t xml:space="preserve">  </w:t>
+      </w:r>
+      <w:r>
+        <w:rPr>
+          <w:rStyle w:val="AttributeTok"/>
+        </w:rPr>
+        <w:t xml:space="preserve">y.high =</w:t>
+      </w:r>
+      <w:r>
+        <w:rPr>
+          <w:rStyle w:val="NormalTok"/>
+        </w:rPr>
+        <w:t xml:space="preserve"> </w:t>
+      </w:r>
+      <w:r>
+        <w:rPr>
+          <w:rStyle w:val="FunctionTok"/>
+        </w:rPr>
+        <w:t xml:space="preserve">c</w:t>
+      </w:r>
+      <w:r>
+        <w:rPr>
+          <w:rStyle w:val="NormalTok"/>
+        </w:rPr>
+        <w:t xml:space="preserve">(</w:t>
+      </w:r>
+      <w:r>
+        <w:rPr>
+          <w:rStyle w:val="DecValTok"/>
+        </w:rPr>
+        <w:t xml:space="preserve">200</w:t>
+      </w:r>
+      <w:r>
+        <w:rPr>
+          <w:rStyle w:val="NormalTok"/>
+        </w:rPr>
+        <w:t xml:space="preserve">, </w:t>
+      </w:r>
+      <w:r>
+        <w:rPr>
+          <w:rStyle w:val="DecValTok"/>
+        </w:rPr>
+        <w:t xml:space="preserve">200</w:t>
+      </w:r>
+      <w:r>
+        <w:rPr>
+          <w:rStyle w:val="NormalTok"/>
+        </w:rPr>
+        <w:t xml:space="preserve">)</w:t>
+      </w:r>
+      <w:r>
+        <w:br/>
+      </w:r>
+      <w:r>
+        <w:rPr>
+          <w:rStyle w:val="NormalTok"/>
+        </w:rPr>
+        <w:t xml:space="preserve">) </w:t>
+      </w:r>
+      <w:r>
+        <w:rPr>
+          <w:rStyle w:val="SpecialCharTok"/>
+        </w:rPr>
+        <w:t xml:space="preserve">|&gt;</w:t>
+      </w:r>
+      <w:r>
+        <w:rPr>
+          <w:rStyle w:val="NormalTok"/>
+        </w:rPr>
+        <w:t xml:space="preserve"> </w:t>
+      </w:r>
+      <w:r>
+        <w:rPr>
+          <w:rStyle w:val="CommentTok"/>
+        </w:rPr>
+        <w:t xml:space="preserve"># high cutoff (y.high)</w:t>
+      </w:r>
+      <w:r>
+        <w:br/>
+      </w:r>
+      <w:r>
+        <w:rPr>
+          <w:rStyle w:val="NormalTok"/>
+        </w:rPr>
+        <w:t xml:space="preserve">  </w:t>
+      </w:r>
+      <w:r>
+        <w:rPr>
+          <w:rStyle w:val="FunctionTok"/>
+        </w:rPr>
+        <w:t xml:space="preserve">mutate</w:t>
+      </w:r>
+      <w:r>
+        <w:rPr>
+          <w:rStyle w:val="NormalTok"/>
+        </w:rPr>
+        <w:t xml:space="preserve">(</w:t>
+      </w:r>
+      <w:r>
+        <w:rPr>
+          <w:rStyle w:val="FunctionTok"/>
+        </w:rPr>
+        <w:t xml:space="preserve">across</w:t>
+      </w:r>
+      <w:r>
+        <w:rPr>
+          <w:rStyle w:val="NormalTok"/>
+        </w:rPr>
+        <w:t xml:space="preserve">(</w:t>
+      </w:r>
+      <w:r>
+        <w:rPr>
+          <w:rStyle w:val="FunctionTok"/>
+        </w:rPr>
+        <w:t xml:space="preserve">where</w:t>
+      </w:r>
+      <w:r>
+        <w:rPr>
+          <w:rStyle w:val="NormalTok"/>
+        </w:rPr>
+        <w:t xml:space="preserve">(is.numeric), round, </w:t>
+      </w:r>
+      <w:r>
+        <w:rPr>
+          <w:rStyle w:val="AttributeTok"/>
+        </w:rPr>
+        <w:t xml:space="preserve">digits =</w:t>
+      </w:r>
+      <w:r>
+        <w:rPr>
+          <w:rStyle w:val="NormalTok"/>
+        </w:rPr>
+        <w:t xml:space="preserve"> </w:t>
+      </w:r>
+      <w:r>
+        <w:rPr>
+          <w:rStyle w:val="DecValTok"/>
+        </w:rPr>
+        <w:t xml:space="preserve">2</w:t>
+      </w:r>
+      <w:r>
+        <w:rPr>
+          <w:rStyle w:val="NormalTok"/>
+        </w:rPr>
+        <w:t xml:space="preserve">))</w:t>
       </w:r>
     </w:p>
     <w:bookmarkEnd w:id="31"/>
@@ -1321,7 +3043,253 @@
       </w:pPr>
       <w:r>
         <w:rPr>
-          <w:rStyle w:val="VerbatimChar"/>
+          <w:rStyle w:val="CommentTok"/>
+        </w:rPr>
+        <w:t xml:space="preserve"># Using est.incidence.by (strata)</w:t>
+      </w:r>
+      <w:r>
+        <w:br/>
+      </w:r>
+      <w:r>
+        <w:br/>
+      </w:r>
+      <w:r>
+        <w:rPr>
+          <w:rStyle w:val="NormalTok"/>
+        </w:rPr>
+        <w:t xml:space="preserve">est </w:t>
+      </w:r>
+      <w:r>
+        <w:rPr>
+          <w:rStyle w:val="OtherTok"/>
+        </w:rPr>
+        <w:t xml:space="preserve">&lt;-</w:t>
+      </w:r>
+      <w:r>
+        <w:rPr>
+          <w:rStyle w:val="NormalTok"/>
+        </w:rPr>
+        <w:t xml:space="preserve"> </w:t>
+      </w:r>
+      <w:r>
+        <w:rPr>
+          <w:rStyle w:val="FunctionTok"/>
+        </w:rPr>
+        <w:t xml:space="preserve">est_seroincidence_by</w:t>
+      </w:r>
+      <w:r>
+        <w:rPr>
+          <w:rStyle w:val="NormalTok"/>
+        </w:rPr>
+        <w:t xml:space="preserve">(</w:t>
+      </w:r>
+      <w:r>
+        <w:br/>
+      </w:r>
+      <w:r>
+        <w:rPr>
+          <w:rStyle w:val="NormalTok"/>
+        </w:rPr>
+        <w:t xml:space="preserve">  </w:t>
+      </w:r>
+      <w:r>
+        <w:rPr>
+          <w:rStyle w:val="AttributeTok"/>
+        </w:rPr>
+        <w:t xml:space="preserve">strata =</w:t>
+      </w:r>
+      <w:r>
+        <w:rPr>
+          <w:rStyle w:val="NormalTok"/>
+        </w:rPr>
+        <w:t xml:space="preserve"> </w:t>
+      </w:r>
+      <w:r>
+        <w:rPr>
+          <w:rStyle w:val="FunctionTok"/>
+        </w:rPr>
+        <w:t xml:space="preserve">c</w:t>
+      </w:r>
+      <w:r>
+        <w:rPr>
+          <w:rStyle w:val="NormalTok"/>
+        </w:rPr>
+        <w:t xml:space="preserve">(</w:t>
+      </w:r>
+      <w:r>
+        <w:rPr>
+          <w:rStyle w:val="StringTok"/>
+        </w:rPr>
+        <w:t xml:space="preserve">"country"</w:t>
+      </w:r>
+      <w:r>
+        <w:rPr>
+          <w:rStyle w:val="NormalTok"/>
+        </w:rPr>
+        <w:t xml:space="preserve">),</w:t>
+      </w:r>
+      <w:r>
+        <w:br/>
+      </w:r>
+      <w:r>
+        <w:rPr>
+          <w:rStyle w:val="NormalTok"/>
+        </w:rPr>
+        <w:t xml:space="preserve">  </w:t>
+      </w:r>
+      <w:r>
+        <w:rPr>
+          <w:rStyle w:val="AttributeTok"/>
+        </w:rPr>
+        <w:t xml:space="preserve">pop_data =</w:t>
+      </w:r>
+      <w:r>
+        <w:rPr>
+          <w:rStyle w:val="NormalTok"/>
+        </w:rPr>
+        <w:t xml:space="preserve"> xs_data,</w:t>
+      </w:r>
+      <w:r>
+        <w:br/>
+      </w:r>
+      <w:r>
+        <w:rPr>
+          <w:rStyle w:val="NormalTok"/>
+        </w:rPr>
+        <w:t xml:space="preserve">  </w:t>
+      </w:r>
+      <w:r>
+        <w:rPr>
+          <w:rStyle w:val="AttributeTok"/>
+        </w:rPr>
+        <w:t xml:space="preserve">sr_params =</w:t>
+      </w:r>
+      <w:r>
+        <w:rPr>
+          <w:rStyle w:val="NormalTok"/>
+        </w:rPr>
+        <w:t xml:space="preserve"> curves,</w:t>
+      </w:r>
+      <w:r>
+        <w:br/>
+      </w:r>
+      <w:r>
+        <w:rPr>
+          <w:rStyle w:val="NormalTok"/>
+        </w:rPr>
+        <w:t xml:space="preserve">  </w:t>
+      </w:r>
+      <w:r>
+        <w:rPr>
+          <w:rStyle w:val="AttributeTok"/>
+        </w:rPr>
+        <w:t xml:space="preserve">noise_params =</w:t>
+      </w:r>
+      <w:r>
+        <w:rPr>
+          <w:rStyle w:val="NormalTok"/>
+        </w:rPr>
+        <w:t xml:space="preserve"> noise,</w:t>
+      </w:r>
+      <w:r>
+        <w:br/>
+      </w:r>
+      <w:r>
+        <w:rPr>
+          <w:rStyle w:val="NormalTok"/>
+        </w:rPr>
+        <w:t xml:space="preserve">  </w:t>
+      </w:r>
+      <w:r>
+        <w:rPr>
+          <w:rStyle w:val="AttributeTok"/>
+        </w:rPr>
+        <w:t xml:space="preserve">antigen_isos =</w:t>
+      </w:r>
+      <w:r>
+        <w:rPr>
+          <w:rStyle w:val="NormalTok"/>
+        </w:rPr>
+        <w:t xml:space="preserve"> </w:t>
+      </w:r>
+      <w:r>
+        <w:rPr>
+          <w:rStyle w:val="FunctionTok"/>
+        </w:rPr>
+        <w:t xml:space="preserve">c</w:t>
+      </w:r>
+      <w:r>
+        <w:rPr>
+          <w:rStyle w:val="NormalTok"/>
+        </w:rPr>
+        <w:t xml:space="preserve">(</w:t>
+      </w:r>
+      <w:r>
+        <w:rPr>
+          <w:rStyle w:val="StringTok"/>
+        </w:rPr>
+        <w:t xml:space="preserve">"OT56kda_IgG"</w:t>
+      </w:r>
+      <w:r>
+        <w:rPr>
+          <w:rStyle w:val="NormalTok"/>
+        </w:rPr>
+        <w:t xml:space="preserve">),</w:t>
+      </w:r>
+      <w:r>
+        <w:br/>
+      </w:r>
+      <w:r>
+        <w:rPr>
+          <w:rStyle w:val="NormalTok"/>
+        </w:rPr>
+        <w:t xml:space="preserve">  </w:t>
+      </w:r>
+      <w:r>
+        <w:rPr>
+          <w:rStyle w:val="AttributeTok"/>
+        </w:rPr>
+        <w:t xml:space="preserve">num_cores =</w:t>
+      </w:r>
+      <w:r>
+        <w:rPr>
+          <w:rStyle w:val="NormalTok"/>
+        </w:rPr>
+        <w:t xml:space="preserve"> </w:t>
+      </w:r>
+      <w:r>
+        <w:rPr>
+          <w:rStyle w:val="DecValTok"/>
+        </w:rPr>
+        <w:t xml:space="preserve">8</w:t>
+      </w:r>
+      <w:r>
+        <w:rPr>
+          <w:rStyle w:val="NormalTok"/>
+        </w:rPr>
+        <w:t xml:space="preserve"> </w:t>
+      </w:r>
+      <w:r>
+        <w:rPr>
+          <w:rStyle w:val="CommentTok"/>
+        </w:rPr>
+        <w:t xml:space="preserve"># Allow for parallel processing to decrease run time</w:t>
+      </w:r>
+      <w:r>
+        <w:br/>
+      </w:r>
+      <w:r>
+        <w:rPr>
+          <w:rStyle w:val="NormalTok"/>
+        </w:rPr>
+        <w:t xml:space="preserve">)</w:t>
+      </w:r>
+      <w:r>
+        <w:br/>
+      </w:r>
+      <w:r>
+        <w:rPr>
+          <w:rStyle w:val="CommentTok"/>
         </w:rPr>
         <w:t xml:space="preserve">#&gt; Warning: `curve_params` is missing all strata variables and will be used unstratified.</w:t>
       </w:r>
@@ -1330,7 +3298,7 @@
       </w:r>
       <w:r>
         <w:rPr>
-          <w:rStyle w:val="VerbatimChar"/>
+          <w:rStyle w:val="CommentTok"/>
         </w:rPr>
         <w:t xml:space="preserve">#&gt; ℹ To avoid this warning, specify the desired set of stratifying variables in</w:t>
       </w:r>
@@ -1339,7 +3307,7 @@
       </w:r>
       <w:r>
         <w:rPr>
-          <w:rStyle w:val="VerbatimChar"/>
+          <w:rStyle w:val="CommentTok"/>
         </w:rPr>
         <w:t xml:space="preserve">#&gt;   the `curve_strata_varnames` and `noise_strata_varnames` arguments to</w:t>
       </w:r>
@@ -1348,7 +3316,7 @@
       </w:r>
       <w:r>
         <w:rPr>
-          <w:rStyle w:val="VerbatimChar"/>
+          <w:rStyle w:val="CommentTok"/>
         </w:rPr>
         <w:t xml:space="preserve">#&gt;   `est_seroincidence_by()`.</w:t>
       </w:r>
@@ -1357,7 +3325,7 @@
       </w:r>
       <w:r>
         <w:rPr>
-          <w:rStyle w:val="VerbatimChar"/>
+          <w:rStyle w:val="CommentTok"/>
         </w:rPr>
         <w:t xml:space="preserve">#&gt; Warning: `noise_params` is missing all strata variables and will be used unstratified.</w:t>
       </w:r>
@@ -1366,7 +3334,7 @@
       </w:r>
       <w:r>
         <w:rPr>
-          <w:rStyle w:val="VerbatimChar"/>
+          <w:rStyle w:val="CommentTok"/>
         </w:rPr>
         <w:t xml:space="preserve">#&gt; ℹ To avoid this warning, specify the desired set of stratifying variables in</w:t>
       </w:r>
@@ -1375,7 +3343,7 @@
       </w:r>
       <w:r>
         <w:rPr>
-          <w:rStyle w:val="VerbatimChar"/>
+          <w:rStyle w:val="CommentTok"/>
         </w:rPr>
         <w:t xml:space="preserve">#&gt;   the `curve_strata_varnames` and `noise_strata_varnames` arguments to</w:t>
       </w:r>
@@ -1384,7 +3352,7 @@
       </w:r>
       <w:r>
         <w:rPr>
-          <w:rStyle w:val="VerbatimChar"/>
+          <w:rStyle w:val="CommentTok"/>
         </w:rPr>
         <w:t xml:space="preserve">#&gt;   `est_seroincidence_by()`.</w:t>
       </w:r>
@@ -1392,8 +3360,26 @@
         <w:br/>
       </w:r>
       <w:r>
-        <w:rPr>
-          <w:rStyle w:val="VerbatimChar"/>
+        <w:br/>
+      </w:r>
+      <w:r>
+        <w:rPr>
+          <w:rStyle w:val="FunctionTok"/>
+        </w:rPr>
+        <w:t xml:space="preserve">summary</w:t>
+      </w:r>
+      <w:r>
+        <w:rPr>
+          <w:rStyle w:val="NormalTok"/>
+        </w:rPr>
+        <w:t xml:space="preserve">(est)</w:t>
+      </w:r>
+      <w:r>
+        <w:br/>
+      </w:r>
+      <w:r>
+        <w:rPr>
+          <w:rStyle w:val="CommentTok"/>
         </w:rPr>
         <w:t xml:space="preserve">#&gt; Seroincidence estimated given the following setup:</w:t>
       </w:r>
@@ -1402,7 +3388,7 @@
       </w:r>
       <w:r>
         <w:rPr>
-          <w:rStyle w:val="VerbatimChar"/>
+          <w:rStyle w:val="CommentTok"/>
         </w:rPr>
         <w:t xml:space="preserve">#&gt; a) Antigen isotypes   : OT56kda_IgG </w:t>
       </w:r>
@@ -1411,7 +3397,7 @@
       </w:r>
       <w:r>
         <w:rPr>
-          <w:rStyle w:val="VerbatimChar"/>
+          <w:rStyle w:val="CommentTok"/>
         </w:rPr>
         <w:t xml:space="preserve">#&gt; b) Strata       : country </w:t>
       </w:r>
@@ -1420,7 +3406,7 @@
       </w:r>
       <w:r>
         <w:rPr>
-          <w:rStyle w:val="VerbatimChar"/>
+          <w:rStyle w:val="CommentTok"/>
         </w:rPr>
         <w:t xml:space="preserve">#&gt; </w:t>
       </w:r>
@@ -1429,7 +3415,7 @@
       </w:r>
       <w:r>
         <w:rPr>
-          <w:rStyle w:val="VerbatimChar"/>
+          <w:rStyle w:val="CommentTok"/>
         </w:rPr>
         <w:t xml:space="preserve">#&gt;  Seroincidence estimates:</w:t>
       </w:r>
@@ -1438,7 +3424,7 @@
       </w:r>
       <w:r>
         <w:rPr>
-          <w:rStyle w:val="VerbatimChar"/>
+          <w:rStyle w:val="CommentTok"/>
         </w:rPr>
         <w:t xml:space="preserve">#&gt; # A tibble: 2 × 14</w:t>
       </w:r>
@@ -1447,7 +3433,7 @@
       </w:r>
       <w:r>
         <w:rPr>
-          <w:rStyle w:val="VerbatimChar"/>
+          <w:rStyle w:val="CommentTok"/>
         </w:rPr>
         <w:t xml:space="preserve">#&gt;   Stratum  country     n est.start incidence.rate      SE  CI.lwr CI.upr se_type</w:t>
       </w:r>
@@ -1456,7 +3442,7 @@
       </w:r>
       <w:r>
         <w:rPr>
-          <w:rStyle w:val="VerbatimChar"/>
+          <w:rStyle w:val="CommentTok"/>
         </w:rPr>
         <w:t xml:space="preserve">#&gt;   &lt;chr&gt;    &lt;fct&gt;   &lt;int&gt;     &lt;dbl&gt;          &lt;dbl&gt;   &lt;dbl&gt;   &lt;dbl&gt;  &lt;dbl&gt; &lt;chr&gt;  </w:t>
       </w:r>
@@ -1465,7 +3451,7 @@
       </w:r>
       <w:r>
         <w:rPr>
-          <w:rStyle w:val="VerbatimChar"/>
+          <w:rStyle w:val="CommentTok"/>
         </w:rPr>
         <w:t xml:space="preserve">#&gt; 1 Stratum… India     721       0.1        0.0202  0.00148 0.0175  0.0233 standa…</w:t>
       </w:r>
@@ -1474,7 +3460,7 @@
       </w:r>
       <w:r>
         <w:rPr>
-          <w:rStyle w:val="VerbatimChar"/>
+          <w:rStyle w:val="CommentTok"/>
         </w:rPr>
         <w:t xml:space="preserve">#&gt; 2 Stratum… Nepal    1105       0.1        0.00854 0.00107 0.00668 0.0109 standa…</w:t>
       </w:r>
@@ -1483,7 +3469,7 @@
       </w:r>
       <w:r>
         <w:rPr>
-          <w:rStyle w:val="VerbatimChar"/>
+          <w:rStyle w:val="CommentTok"/>
         </w:rPr>
         <w:t xml:space="preserve">#&gt; # ℹ 5 more variables: coverage &lt;dbl&gt;, log.lik &lt;dbl&gt;, iterations &lt;int&gt;,</w:t>
       </w:r>
@@ -1492,7 +3478,7 @@
       </w:r>
       <w:r>
         <w:rPr>
-          <w:rStyle w:val="VerbatimChar"/>
+          <w:rStyle w:val="CommentTok"/>
         </w:rPr>
         <w:t xml:space="preserve">#&gt; #   antigen.isos &lt;chr&gt;, nlm.convergence.code &lt;ord&gt;</w:t>
       </w:r>
@@ -1536,7 +3522,265 @@
       </w:pPr>
       <w:r>
         <w:rPr>
-          <w:rStyle w:val="VerbatimChar"/>
+          <w:rStyle w:val="CommentTok"/>
+        </w:rPr>
+        <w:t xml:space="preserve"># Using est.incidence.by (strata)</w:t>
+      </w:r>
+      <w:r>
+        <w:br/>
+      </w:r>
+      <w:r>
+        <w:br/>
+      </w:r>
+      <w:r>
+        <w:rPr>
+          <w:rStyle w:val="NormalTok"/>
+        </w:rPr>
+        <w:t xml:space="preserve">est2 </w:t>
+      </w:r>
+      <w:r>
+        <w:rPr>
+          <w:rStyle w:val="OtherTok"/>
+        </w:rPr>
+        <w:t xml:space="preserve">&lt;-</w:t>
+      </w:r>
+      <w:r>
+        <w:rPr>
+          <w:rStyle w:val="NormalTok"/>
+        </w:rPr>
+        <w:t xml:space="preserve"> </w:t>
+      </w:r>
+      <w:r>
+        <w:rPr>
+          <w:rStyle w:val="FunctionTok"/>
+        </w:rPr>
+        <w:t xml:space="preserve">est_seroincidence_by</w:t>
+      </w:r>
+      <w:r>
+        <w:rPr>
+          <w:rStyle w:val="NormalTok"/>
+        </w:rPr>
+        <w:t xml:space="preserve">(</w:t>
+      </w:r>
+      <w:r>
+        <w:br/>
+      </w:r>
+      <w:r>
+        <w:rPr>
+          <w:rStyle w:val="NormalTok"/>
+        </w:rPr>
+        <w:t xml:space="preserve">  </w:t>
+      </w:r>
+      <w:r>
+        <w:rPr>
+          <w:rStyle w:val="AttributeTok"/>
+        </w:rPr>
+        <w:t xml:space="preserve">strata =</w:t>
+      </w:r>
+      <w:r>
+        <w:rPr>
+          <w:rStyle w:val="NormalTok"/>
+        </w:rPr>
+        <w:t xml:space="preserve"> </w:t>
+      </w:r>
+      <w:r>
+        <w:rPr>
+          <w:rStyle w:val="FunctionTok"/>
+        </w:rPr>
+        <w:t xml:space="preserve">c</w:t>
+      </w:r>
+      <w:r>
+        <w:rPr>
+          <w:rStyle w:val="NormalTok"/>
+        </w:rPr>
+        <w:t xml:space="preserve">(</w:t>
+      </w:r>
+      <w:r>
+        <w:rPr>
+          <w:rStyle w:val="StringTok"/>
+        </w:rPr>
+        <w:t xml:space="preserve">"country"</w:t>
+      </w:r>
+      <w:r>
+        <w:rPr>
+          <w:rStyle w:val="NormalTok"/>
+        </w:rPr>
+        <w:t xml:space="preserve">, </w:t>
+      </w:r>
+      <w:r>
+        <w:rPr>
+          <w:rStyle w:val="StringTok"/>
+        </w:rPr>
+        <w:t xml:space="preserve">"ageQ"</w:t>
+      </w:r>
+      <w:r>
+        <w:rPr>
+          <w:rStyle w:val="NormalTok"/>
+        </w:rPr>
+        <w:t xml:space="preserve">),</w:t>
+      </w:r>
+      <w:r>
+        <w:br/>
+      </w:r>
+      <w:r>
+        <w:rPr>
+          <w:rStyle w:val="NormalTok"/>
+        </w:rPr>
+        <w:t xml:space="preserve">  </w:t>
+      </w:r>
+      <w:r>
+        <w:rPr>
+          <w:rStyle w:val="AttributeTok"/>
+        </w:rPr>
+        <w:t xml:space="preserve">pop_data =</w:t>
+      </w:r>
+      <w:r>
+        <w:rPr>
+          <w:rStyle w:val="NormalTok"/>
+        </w:rPr>
+        <w:t xml:space="preserve"> xs_data,</w:t>
+      </w:r>
+      <w:r>
+        <w:br/>
+      </w:r>
+      <w:r>
+        <w:rPr>
+          <w:rStyle w:val="NormalTok"/>
+        </w:rPr>
+        <w:t xml:space="preserve">  </w:t>
+      </w:r>
+      <w:r>
+        <w:rPr>
+          <w:rStyle w:val="AttributeTok"/>
+        </w:rPr>
+        <w:t xml:space="preserve">sr_params =</w:t>
+      </w:r>
+      <w:r>
+        <w:rPr>
+          <w:rStyle w:val="NormalTok"/>
+        </w:rPr>
+        <w:t xml:space="preserve"> curves,</w:t>
+      </w:r>
+      <w:r>
+        <w:br/>
+      </w:r>
+      <w:r>
+        <w:rPr>
+          <w:rStyle w:val="NormalTok"/>
+        </w:rPr>
+        <w:t xml:space="preserve">  </w:t>
+      </w:r>
+      <w:r>
+        <w:rPr>
+          <w:rStyle w:val="AttributeTok"/>
+        </w:rPr>
+        <w:t xml:space="preserve">noise_params =</w:t>
+      </w:r>
+      <w:r>
+        <w:rPr>
+          <w:rStyle w:val="NormalTok"/>
+        </w:rPr>
+        <w:t xml:space="preserve"> noise,</w:t>
+      </w:r>
+      <w:r>
+        <w:br/>
+      </w:r>
+      <w:r>
+        <w:rPr>
+          <w:rStyle w:val="NormalTok"/>
+        </w:rPr>
+        <w:t xml:space="preserve">  </w:t>
+      </w:r>
+      <w:r>
+        <w:rPr>
+          <w:rStyle w:val="AttributeTok"/>
+        </w:rPr>
+        <w:t xml:space="preserve">antigen_isos =</w:t>
+      </w:r>
+      <w:r>
+        <w:rPr>
+          <w:rStyle w:val="NormalTok"/>
+        </w:rPr>
+        <w:t xml:space="preserve"> </w:t>
+      </w:r>
+      <w:r>
+        <w:rPr>
+          <w:rStyle w:val="FunctionTok"/>
+        </w:rPr>
+        <w:t xml:space="preserve">c</w:t>
+      </w:r>
+      <w:r>
+        <w:rPr>
+          <w:rStyle w:val="NormalTok"/>
+        </w:rPr>
+        <w:t xml:space="preserve">(</w:t>
+      </w:r>
+      <w:r>
+        <w:rPr>
+          <w:rStyle w:val="StringTok"/>
+        </w:rPr>
+        <w:t xml:space="preserve">"OT56kda_IgG"</w:t>
+      </w:r>
+      <w:r>
+        <w:rPr>
+          <w:rStyle w:val="NormalTok"/>
+        </w:rPr>
+        <w:t xml:space="preserve">),</w:t>
+      </w:r>
+      <w:r>
+        <w:br/>
+      </w:r>
+      <w:r>
+        <w:rPr>
+          <w:rStyle w:val="NormalTok"/>
+        </w:rPr>
+        <w:t xml:space="preserve">  </w:t>
+      </w:r>
+      <w:r>
+        <w:rPr>
+          <w:rStyle w:val="AttributeTok"/>
+        </w:rPr>
+        <w:t xml:space="preserve">num_cores =</w:t>
+      </w:r>
+      <w:r>
+        <w:rPr>
+          <w:rStyle w:val="NormalTok"/>
+        </w:rPr>
+        <w:t xml:space="preserve"> </w:t>
+      </w:r>
+      <w:r>
+        <w:rPr>
+          <w:rStyle w:val="DecValTok"/>
+        </w:rPr>
+        <w:t xml:space="preserve">8</w:t>
+      </w:r>
+      <w:r>
+        <w:rPr>
+          <w:rStyle w:val="NormalTok"/>
+        </w:rPr>
+        <w:t xml:space="preserve"> </w:t>
+      </w:r>
+      <w:r>
+        <w:rPr>
+          <w:rStyle w:val="CommentTok"/>
+        </w:rPr>
+        <w:t xml:space="preserve"># Allow for parallel processing to decrease run time</w:t>
+      </w:r>
+      <w:r>
+        <w:br/>
+      </w:r>
+      <w:r>
+        <w:rPr>
+          <w:rStyle w:val="NormalTok"/>
+        </w:rPr>
+        <w:t xml:space="preserve">)</w:t>
+      </w:r>
+      <w:r>
+        <w:br/>
+      </w:r>
+      <w:r>
+        <w:rPr>
+          <w:rStyle w:val="CommentTok"/>
         </w:rPr>
         <w:t xml:space="preserve">#&gt; Warning: Some strata are completely missing one or more biomarkers.</w:t>
       </w:r>
@@ -1545,7 +3789,7 @@
       </w:r>
       <w:r>
         <w:rPr>
-          <w:rStyle w:val="VerbatimChar"/>
+          <w:rStyle w:val="CommentTok"/>
         </w:rPr>
         <w:t xml:space="preserve">#&gt; , , antigen_iso = OT56kda_IgM</w:t>
       </w:r>
@@ -1554,7 +3798,7 @@
       </w:r>
       <w:r>
         <w:rPr>
-          <w:rStyle w:val="VerbatimChar"/>
+          <w:rStyle w:val="CommentTok"/>
         </w:rPr>
         <w:t xml:space="preserve">#&gt; </w:t>
       </w:r>
@@ -1563,7 +3807,7 @@
       </w:r>
       <w:r>
         <w:rPr>
-          <w:rStyle w:val="VerbatimChar"/>
+          <w:rStyle w:val="CommentTok"/>
         </w:rPr>
         <w:t xml:space="preserve">#&gt;        ageQ</w:t>
       </w:r>
@@ -1572,7 +3816,7 @@
       </w:r>
       <w:r>
         <w:rPr>
-          <w:rStyle w:val="VerbatimChar"/>
+          <w:rStyle w:val="CommentTok"/>
         </w:rPr>
         <w:t xml:space="preserve">#&gt; country 0-17 18-29 30-49 50-89</w:t>
       </w:r>
@@ -1581,7 +3825,7 @@
       </w:r>
       <w:r>
         <w:rPr>
-          <w:rStyle w:val="VerbatimChar"/>
+          <w:rStyle w:val="CommentTok"/>
         </w:rPr>
         <w:t xml:space="preserve">#&gt;   India    0    59   302   360</w:t>
       </w:r>
@@ -1590,7 +3834,7 @@
       </w:r>
       <w:r>
         <w:rPr>
-          <w:rStyle w:val="VerbatimChar"/>
+          <w:rStyle w:val="CommentTok"/>
         </w:rPr>
         <w:t xml:space="preserve">#&gt;   Nepal  876   229     0     0</w:t>
       </w:r>
@@ -1599,7 +3843,7 @@
       </w:r>
       <w:r>
         <w:rPr>
-          <w:rStyle w:val="VerbatimChar"/>
+          <w:rStyle w:val="CommentTok"/>
         </w:rPr>
         <w:t xml:space="preserve">#&gt; </w:t>
       </w:r>
@@ -1608,7 +3852,7 @@
       </w:r>
       <w:r>
         <w:rPr>
-          <w:rStyle w:val="VerbatimChar"/>
+          <w:rStyle w:val="CommentTok"/>
         </w:rPr>
         <w:t xml:space="preserve">#&gt; , , antigen_iso = OT56kda_IgG</w:t>
       </w:r>
@@ -1617,7 +3861,7 @@
       </w:r>
       <w:r>
         <w:rPr>
-          <w:rStyle w:val="VerbatimChar"/>
+          <w:rStyle w:val="CommentTok"/>
         </w:rPr>
         <w:t xml:space="preserve">#&gt; </w:t>
       </w:r>
@@ -1626,7 +3870,7 @@
       </w:r>
       <w:r>
         <w:rPr>
-          <w:rStyle w:val="VerbatimChar"/>
+          <w:rStyle w:val="CommentTok"/>
         </w:rPr>
         <w:t xml:space="preserve">#&gt;        ageQ</w:t>
       </w:r>
@@ -1635,7 +3879,7 @@
       </w:r>
       <w:r>
         <w:rPr>
-          <w:rStyle w:val="VerbatimChar"/>
+          <w:rStyle w:val="CommentTok"/>
         </w:rPr>
         <w:t xml:space="preserve">#&gt; country 0-17 18-29 30-49 50-89</w:t>
       </w:r>
@@ -1644,7 +3888,7 @@
       </w:r>
       <w:r>
         <w:rPr>
-          <w:rStyle w:val="VerbatimChar"/>
+          <w:rStyle w:val="CommentTok"/>
         </w:rPr>
         <w:t xml:space="preserve">#&gt;   India    0    59   302   360</w:t>
       </w:r>
@@ -1653,7 +3897,7 @@
       </w:r>
       <w:r>
         <w:rPr>
-          <w:rStyle w:val="VerbatimChar"/>
+          <w:rStyle w:val="CommentTok"/>
         </w:rPr>
         <w:t xml:space="preserve">#&gt;   Nepal  876   229     0     0</w:t>
       </w:r>
@@ -1662,7 +3906,7 @@
       </w:r>
       <w:r>
         <w:rPr>
-          <w:rStyle w:val="VerbatimChar"/>
+          <w:rStyle w:val="CommentTok"/>
         </w:rPr>
         <w:t xml:space="preserve">#&gt; Warning: `curve_params` is missing all strata variables and will be used unstratified.</w:t>
       </w:r>
@@ -1671,7 +3915,7 @@
       </w:r>
       <w:r>
         <w:rPr>
-          <w:rStyle w:val="VerbatimChar"/>
+          <w:rStyle w:val="CommentTok"/>
         </w:rPr>
         <w:t xml:space="preserve">#&gt; ℹ To avoid this warning, specify the desired set of stratifying variables in</w:t>
       </w:r>
@@ -1680,7 +3924,7 @@
       </w:r>
       <w:r>
         <w:rPr>
-          <w:rStyle w:val="VerbatimChar"/>
+          <w:rStyle w:val="CommentTok"/>
         </w:rPr>
         <w:t xml:space="preserve">#&gt;   the `curve_strata_varnames` and `noise_strata_varnames` arguments to</w:t>
       </w:r>
@@ -1689,7 +3933,7 @@
       </w:r>
       <w:r>
         <w:rPr>
-          <w:rStyle w:val="VerbatimChar"/>
+          <w:rStyle w:val="CommentTok"/>
         </w:rPr>
         <w:t xml:space="preserve">#&gt;   `est_seroincidence_by()`.</w:t>
       </w:r>
@@ -1698,7 +3942,7 @@
       </w:r>
       <w:r>
         <w:rPr>
-          <w:rStyle w:val="VerbatimChar"/>
+          <w:rStyle w:val="CommentTok"/>
         </w:rPr>
         <w:t xml:space="preserve">#&gt; Warning: `noise_params` is missing all strata variables and will be used unstratified.</w:t>
       </w:r>
@@ -1707,7 +3951,7 @@
       </w:r>
       <w:r>
         <w:rPr>
-          <w:rStyle w:val="VerbatimChar"/>
+          <w:rStyle w:val="CommentTok"/>
         </w:rPr>
         <w:t xml:space="preserve">#&gt; ℹ To avoid this warning, specify the desired set of stratifying variables in</w:t>
       </w:r>
@@ -1716,7 +3960,7 @@
       </w:r>
       <w:r>
         <w:rPr>
-          <w:rStyle w:val="VerbatimChar"/>
+          <w:rStyle w:val="CommentTok"/>
         </w:rPr>
         <w:t xml:space="preserve">#&gt;   the `curve_strata_varnames` and `noise_strata_varnames` arguments to</w:t>
       </w:r>
@@ -1725,7 +3969,7 @@
       </w:r>
       <w:r>
         <w:rPr>
-          <w:rStyle w:val="VerbatimChar"/>
+          <w:rStyle w:val="CommentTok"/>
         </w:rPr>
         <w:t xml:space="preserve">#&gt;   `est_seroincidence_by()`.</w:t>
       </w:r>
@@ -1733,8 +3977,26 @@
         <w:br/>
       </w:r>
       <w:r>
-        <w:rPr>
-          <w:rStyle w:val="VerbatimChar"/>
+        <w:br/>
+      </w:r>
+      <w:r>
+        <w:rPr>
+          <w:rStyle w:val="FunctionTok"/>
+        </w:rPr>
+        <w:t xml:space="preserve">summary</w:t>
+      </w:r>
+      <w:r>
+        <w:rPr>
+          <w:rStyle w:val="NormalTok"/>
+        </w:rPr>
+        <w:t xml:space="preserve">(est2)</w:t>
+      </w:r>
+      <w:r>
+        <w:br/>
+      </w:r>
+      <w:r>
+        <w:rPr>
+          <w:rStyle w:val="CommentTok"/>
         </w:rPr>
         <w:t xml:space="preserve">#&gt; Seroincidence estimated given the following setup:</w:t>
       </w:r>
@@ -1743,7 +4005,7 @@
       </w:r>
       <w:r>
         <w:rPr>
-          <w:rStyle w:val="VerbatimChar"/>
+          <w:rStyle w:val="CommentTok"/>
         </w:rPr>
         <w:t xml:space="preserve">#&gt; a) Antigen isotypes   : OT56kda_IgG </w:t>
       </w:r>
@@ -1752,7 +4014,7 @@
       </w:r>
       <w:r>
         <w:rPr>
-          <w:rStyle w:val="VerbatimChar"/>
+          <w:rStyle w:val="CommentTok"/>
         </w:rPr>
         <w:t xml:space="preserve">#&gt; b) Strata       : country, ageQ </w:t>
       </w:r>
@@ -1761,7 +4023,7 @@
       </w:r>
       <w:r>
         <w:rPr>
-          <w:rStyle w:val="VerbatimChar"/>
+          <w:rStyle w:val="CommentTok"/>
         </w:rPr>
         <w:t xml:space="preserve">#&gt; </w:t>
       </w:r>
@@ -1770,7 +4032,7 @@
       </w:r>
       <w:r>
         <w:rPr>
-          <w:rStyle w:val="VerbatimChar"/>
+          <w:rStyle w:val="CommentTok"/>
         </w:rPr>
         <w:t xml:space="preserve">#&gt;  Seroincidence estimates:</w:t>
       </w:r>
@@ -1779,7 +4041,7 @@
       </w:r>
       <w:r>
         <w:rPr>
-          <w:rStyle w:val="VerbatimChar"/>
+          <w:rStyle w:val="CommentTok"/>
         </w:rPr>
         <w:t xml:space="preserve">#&gt; # A tibble: 5 × 15</w:t>
       </w:r>
@@ -1788,7 +4050,7 @@
       </w:r>
       <w:r>
         <w:rPr>
-          <w:rStyle w:val="VerbatimChar"/>
+          <w:rStyle w:val="CommentTok"/>
         </w:rPr>
         <w:t xml:space="preserve">#&gt;   Stratum   country ageQ      n est.start incidence.rate      SE  CI.lwr  CI.upr</w:t>
       </w:r>
@@ -1797,7 +4059,7 @@
       </w:r>
       <w:r>
         <w:rPr>
-          <w:rStyle w:val="VerbatimChar"/>
+          <w:rStyle w:val="CommentTok"/>
         </w:rPr>
         <w:t xml:space="preserve">#&gt;   &lt;chr&gt;     &lt;fct&gt;   &lt;fct&gt; &lt;int&gt;     &lt;dbl&gt;          &lt;dbl&gt;   &lt;dbl&gt;   &lt;dbl&gt;   &lt;dbl&gt;</w:t>
       </w:r>
@@ -1806,7 +4068,7 @@
       </w:r>
       <w:r>
         <w:rPr>
-          <w:rStyle w:val="VerbatimChar"/>
+          <w:rStyle w:val="CommentTok"/>
         </w:rPr>
         <w:t xml:space="preserve">#&gt; 1 Stratum 1 India   18-29    59       0.1        0.00985 0.00330 0.00511 0.0190 </w:t>
       </w:r>
@@ -1815,7 +4077,7 @@
       </w:r>
       <w:r>
         <w:rPr>
-          <w:rStyle w:val="VerbatimChar"/>
+          <w:rStyle w:val="CommentTok"/>
         </w:rPr>
         <w:t xml:space="preserve">#&gt; 2 Stratum 2 India   30-49   302       0.1        0.0151  0.00178 0.0120  0.0190 </w:t>
       </w:r>
@@ -1824,7 +4086,7 @@
       </w:r>
       <w:r>
         <w:rPr>
-          <w:rStyle w:val="VerbatimChar"/>
+          <w:rStyle w:val="CommentTok"/>
         </w:rPr>
         <w:t xml:space="preserve">#&gt; 3 Stratum 3 India   50-89   360       0.1        0.0288  0.00290 0.0236  0.0350 </w:t>
       </w:r>
@@ -1833,7 +4095,7 @@
       </w:r>
       <w:r>
         <w:rPr>
-          <w:rStyle w:val="VerbatimChar"/>
+          <w:rStyle w:val="CommentTok"/>
         </w:rPr>
         <w:t xml:space="preserve">#&gt; 4 Stratum 4 Nepal   0-17    876       0.1        0.00606 0.00108 0.00428 0.00860</w:t>
       </w:r>
@@ -1842,7 +4104,7 @@
       </w:r>
       <w:r>
         <w:rPr>
-          <w:rStyle w:val="VerbatimChar"/>
+          <w:rStyle w:val="CommentTok"/>
         </w:rPr>
         <w:t xml:space="preserve">#&gt; 5 Stratum 5 Nepal   18-29   229       0.1        0.0144  0.00259 0.0101  0.0205 </w:t>
       </w:r>
@@ -1851,7 +4113,7 @@
       </w:r>
       <w:r>
         <w:rPr>
-          <w:rStyle w:val="VerbatimChar"/>
+          <w:rStyle w:val="CommentTok"/>
         </w:rPr>
         <w:t xml:space="preserve">#&gt; # ℹ 6 more variables: se_type &lt;chr&gt;, coverage &lt;dbl&gt;, log.lik &lt;dbl&gt;,</w:t>
       </w:r>
@@ -1860,7 +4122,7 @@
       </w:r>
       <w:r>
         <w:rPr>
-          <w:rStyle w:val="VerbatimChar"/>
+          <w:rStyle w:val="CommentTok"/>
         </w:rPr>
         <w:t xml:space="preserve">#&gt; #   iterations &lt;int&gt;, antigen.isos &lt;chr&gt;, nlm.convergence.code &lt;ord&gt;</w:t>
       </w:r>
@@ -1875,7 +4137,1041 @@
     </w:p>
     <w:p>
       <w:pPr>
-        <w:pStyle w:val="BodyText"/>
+        <w:pStyle w:val="SourceCode"/>
+      </w:pPr>
+      <w:r>
+        <w:rPr>
+          <w:rStyle w:val="CommentTok"/>
+        </w:rPr>
+        <w:t xml:space="preserve"># Plot seroincidence estimates</w:t>
+      </w:r>
+      <w:r>
+        <w:br/>
+      </w:r>
+      <w:r>
+        <w:br/>
+      </w:r>
+      <w:r>
+        <w:rPr>
+          <w:rStyle w:val="CommentTok"/>
+        </w:rPr>
+        <w:t xml:space="preserve"># Save summary(est) as a dataframe</w:t>
+      </w:r>
+      <w:r>
+        <w:br/>
+      </w:r>
+      <w:r>
+        <w:rPr>
+          <w:rStyle w:val="NormalTok"/>
+        </w:rPr>
+        <w:t xml:space="preserve">estdf </w:t>
+      </w:r>
+      <w:r>
+        <w:rPr>
+          <w:rStyle w:val="OtherTok"/>
+        </w:rPr>
+        <w:t xml:space="preserve">&lt;-</w:t>
+      </w:r>
+      <w:r>
+        <w:rPr>
+          <w:rStyle w:val="NormalTok"/>
+        </w:rPr>
+        <w:t xml:space="preserve"> </w:t>
+      </w:r>
+      <w:r>
+        <w:rPr>
+          <w:rStyle w:val="FunctionTok"/>
+        </w:rPr>
+        <w:t xml:space="preserve">summary</w:t>
+      </w:r>
+      <w:r>
+        <w:rPr>
+          <w:rStyle w:val="NormalTok"/>
+        </w:rPr>
+        <w:t xml:space="preserve">(est) </w:t>
+      </w:r>
+      <w:r>
+        <w:rPr>
+          <w:rStyle w:val="SpecialCharTok"/>
+        </w:rPr>
+        <w:t xml:space="preserve">|&gt;</w:t>
+      </w:r>
+      <w:r>
+        <w:br/>
+      </w:r>
+      <w:r>
+        <w:rPr>
+          <w:rStyle w:val="NormalTok"/>
+        </w:rPr>
+        <w:t xml:space="preserve">  </w:t>
+      </w:r>
+      <w:r>
+        <w:rPr>
+          <w:rStyle w:val="FunctionTok"/>
+        </w:rPr>
+        <w:t xml:space="preserve">mutate</w:t>
+      </w:r>
+      <w:r>
+        <w:rPr>
+          <w:rStyle w:val="NormalTok"/>
+        </w:rPr>
+        <w:t xml:space="preserve">(</w:t>
+      </w:r>
+      <w:r>
+        <w:rPr>
+          <w:rStyle w:val="AttributeTok"/>
+        </w:rPr>
+        <w:t xml:space="preserve">ageQ =</w:t>
+      </w:r>
+      <w:r>
+        <w:rPr>
+          <w:rStyle w:val="NormalTok"/>
+        </w:rPr>
+        <w:t xml:space="preserve"> </w:t>
+      </w:r>
+      <w:r>
+        <w:rPr>
+          <w:rStyle w:val="StringTok"/>
+        </w:rPr>
+        <w:t xml:space="preserve">"Overall"</w:t>
+      </w:r>
+      <w:r>
+        <w:rPr>
+          <w:rStyle w:val="NormalTok"/>
+        </w:rPr>
+        <w:t xml:space="preserve">)</w:t>
+      </w:r>
+      <w:r>
+        <w:br/>
+      </w:r>
+      <w:r>
+        <w:br/>
+      </w:r>
+      <w:r>
+        <w:rPr>
+          <w:rStyle w:val="CommentTok"/>
+        </w:rPr>
+        <w:t xml:space="preserve"># Save summary(est2) as a dataframe</w:t>
+      </w:r>
+      <w:r>
+        <w:br/>
+      </w:r>
+      <w:r>
+        <w:rPr>
+          <w:rStyle w:val="NormalTok"/>
+        </w:rPr>
+        <w:t xml:space="preserve">est2df </w:t>
+      </w:r>
+      <w:r>
+        <w:rPr>
+          <w:rStyle w:val="OtherTok"/>
+        </w:rPr>
+        <w:t xml:space="preserve">&lt;-</w:t>
+      </w:r>
+      <w:r>
+        <w:rPr>
+          <w:rStyle w:val="NormalTok"/>
+        </w:rPr>
+        <w:t xml:space="preserve"> </w:t>
+      </w:r>
+      <w:r>
+        <w:rPr>
+          <w:rStyle w:val="FunctionTok"/>
+        </w:rPr>
+        <w:t xml:space="preserve">summary</w:t>
+      </w:r>
+      <w:r>
+        <w:rPr>
+          <w:rStyle w:val="NormalTok"/>
+        </w:rPr>
+        <w:t xml:space="preserve">(est2)</w:t>
+      </w:r>
+      <w:r>
+        <w:br/>
+      </w:r>
+      <w:r>
+        <w:br/>
+      </w:r>
+      <w:r>
+        <w:br/>
+      </w:r>
+      <w:r>
+        <w:rPr>
+          <w:rStyle w:val="NormalTok"/>
+        </w:rPr>
+        <w:t xml:space="preserve">est_comb </w:t>
+      </w:r>
+      <w:r>
+        <w:rPr>
+          <w:rStyle w:val="OtherTok"/>
+        </w:rPr>
+        <w:t xml:space="preserve">&lt;-</w:t>
+      </w:r>
+      <w:r>
+        <w:rPr>
+          <w:rStyle w:val="NormalTok"/>
+        </w:rPr>
+        <w:t xml:space="preserve"> </w:t>
+      </w:r>
+      <w:r>
+        <w:rPr>
+          <w:rStyle w:val="FunctionTok"/>
+        </w:rPr>
+        <w:t xml:space="preserve">rbind</w:t>
+      </w:r>
+      <w:r>
+        <w:rPr>
+          <w:rStyle w:val="NormalTok"/>
+        </w:rPr>
+        <w:t xml:space="preserve">(estdf, est2df)</w:t>
+      </w:r>
+      <w:r>
+        <w:br/>
+      </w:r>
+      <w:r>
+        <w:br/>
+      </w:r>
+      <w:r>
+        <w:rPr>
+          <w:rStyle w:val="CommentTok"/>
+        </w:rPr>
+        <w:t xml:space="preserve"># Create barplot (rescale incidence rate and CIs)</w:t>
+      </w:r>
+      <w:r>
+        <w:br/>
+      </w:r>
+      <w:r>
+        <w:rPr>
+          <w:rStyle w:val="FunctionTok"/>
+        </w:rPr>
+        <w:t xml:space="preserve">ggplot</w:t>
+      </w:r>
+      <w:r>
+        <w:rPr>
+          <w:rStyle w:val="NormalTok"/>
+        </w:rPr>
+        <w:t xml:space="preserve">(est_comb, </w:t>
+      </w:r>
+      <w:r>
+        <w:rPr>
+          <w:rStyle w:val="FunctionTok"/>
+        </w:rPr>
+        <w:t xml:space="preserve">aes</w:t>
+      </w:r>
+      <w:r>
+        <w:rPr>
+          <w:rStyle w:val="NormalTok"/>
+        </w:rPr>
+        <w:t xml:space="preserve">(</w:t>
+      </w:r>
+      <w:r>
+        <w:rPr>
+          <w:rStyle w:val="AttributeTok"/>
+        </w:rPr>
+        <w:t xml:space="preserve">y =</w:t>
+      </w:r>
+      <w:r>
+        <w:rPr>
+          <w:rStyle w:val="NormalTok"/>
+        </w:rPr>
+        <w:t xml:space="preserve"> ageQ, </w:t>
+      </w:r>
+      <w:r>
+        <w:rPr>
+          <w:rStyle w:val="AttributeTok"/>
+        </w:rPr>
+        <w:t xml:space="preserve">x =</w:t>
+      </w:r>
+      <w:r>
+        <w:rPr>
+          <w:rStyle w:val="NormalTok"/>
+        </w:rPr>
+        <w:t xml:space="preserve"> incidence.rate </w:t>
+      </w:r>
+      <w:r>
+        <w:rPr>
+          <w:rStyle w:val="SpecialCharTok"/>
+        </w:rPr>
+        <w:t xml:space="preserve">*</w:t>
+      </w:r>
+      <w:r>
+        <w:rPr>
+          <w:rStyle w:val="NormalTok"/>
+        </w:rPr>
+        <w:t xml:space="preserve"> </w:t>
+      </w:r>
+      <w:r>
+        <w:rPr>
+          <w:rStyle w:val="DecValTok"/>
+        </w:rPr>
+        <w:t xml:space="preserve">1000</w:t>
+      </w:r>
+      <w:r>
+        <w:rPr>
+          <w:rStyle w:val="NormalTok"/>
+        </w:rPr>
+        <w:t xml:space="preserve">, </w:t>
+      </w:r>
+      <w:r>
+        <w:rPr>
+          <w:rStyle w:val="AttributeTok"/>
+        </w:rPr>
+        <w:t xml:space="preserve">fill =</w:t>
+      </w:r>
+      <w:r>
+        <w:rPr>
+          <w:rStyle w:val="NormalTok"/>
+        </w:rPr>
+        <w:t xml:space="preserve"> country)) </w:t>
+      </w:r>
+      <w:r>
+        <w:rPr>
+          <w:rStyle w:val="SpecialCharTok"/>
+        </w:rPr>
+        <w:t xml:space="preserve">+</w:t>
+      </w:r>
+      <w:r>
+        <w:br/>
+      </w:r>
+      <w:r>
+        <w:rPr>
+          <w:rStyle w:val="NormalTok"/>
+        </w:rPr>
+        <w:t xml:space="preserve">  </w:t>
+      </w:r>
+      <w:r>
+        <w:rPr>
+          <w:rStyle w:val="FunctionTok"/>
+        </w:rPr>
+        <w:t xml:space="preserve">geom_bar</w:t>
+      </w:r>
+      <w:r>
+        <w:rPr>
+          <w:rStyle w:val="NormalTok"/>
+        </w:rPr>
+        <w:t xml:space="preserve">(</w:t>
+      </w:r>
+      <w:r>
+        <w:br/>
+      </w:r>
+      <w:r>
+        <w:rPr>
+          <w:rStyle w:val="NormalTok"/>
+        </w:rPr>
+        <w:t xml:space="preserve">    </w:t>
+      </w:r>
+      <w:r>
+        <w:rPr>
+          <w:rStyle w:val="AttributeTok"/>
+        </w:rPr>
+        <w:t xml:space="preserve">stat =</w:t>
+      </w:r>
+      <w:r>
+        <w:rPr>
+          <w:rStyle w:val="NormalTok"/>
+        </w:rPr>
+        <w:t xml:space="preserve"> </w:t>
+      </w:r>
+      <w:r>
+        <w:rPr>
+          <w:rStyle w:val="StringTok"/>
+        </w:rPr>
+        <w:t xml:space="preserve">"identity"</w:t>
+      </w:r>
+      <w:r>
+        <w:rPr>
+          <w:rStyle w:val="NormalTok"/>
+        </w:rPr>
+        <w:t xml:space="preserve">,</w:t>
+      </w:r>
+      <w:r>
+        <w:br/>
+      </w:r>
+      <w:r>
+        <w:rPr>
+          <w:rStyle w:val="NormalTok"/>
+        </w:rPr>
+        <w:t xml:space="preserve">    </w:t>
+      </w:r>
+      <w:r>
+        <w:rPr>
+          <w:rStyle w:val="AttributeTok"/>
+        </w:rPr>
+        <w:t xml:space="preserve">position =</w:t>
+      </w:r>
+      <w:r>
+        <w:rPr>
+          <w:rStyle w:val="NormalTok"/>
+        </w:rPr>
+        <w:t xml:space="preserve"> </w:t>
+      </w:r>
+      <w:r>
+        <w:rPr>
+          <w:rStyle w:val="FunctionTok"/>
+        </w:rPr>
+        <w:t xml:space="preserve">position_dodge2</w:t>
+      </w:r>
+      <w:r>
+        <w:rPr>
+          <w:rStyle w:val="NormalTok"/>
+        </w:rPr>
+        <w:t xml:space="preserve">(</w:t>
+      </w:r>
+      <w:r>
+        <w:rPr>
+          <w:rStyle w:val="AttributeTok"/>
+        </w:rPr>
+        <w:t xml:space="preserve">width =</w:t>
+      </w:r>
+      <w:r>
+        <w:rPr>
+          <w:rStyle w:val="NormalTok"/>
+        </w:rPr>
+        <w:t xml:space="preserve"> </w:t>
+      </w:r>
+      <w:r>
+        <w:rPr>
+          <w:rStyle w:val="FloatTok"/>
+        </w:rPr>
+        <w:t xml:space="preserve">0.8</w:t>
+      </w:r>
+      <w:r>
+        <w:rPr>
+          <w:rStyle w:val="NormalTok"/>
+        </w:rPr>
+        <w:t xml:space="preserve">, </w:t>
+      </w:r>
+      <w:r>
+        <w:rPr>
+          <w:rStyle w:val="AttributeTok"/>
+        </w:rPr>
+        <w:t xml:space="preserve">preserve =</w:t>
+      </w:r>
+      <w:r>
+        <w:rPr>
+          <w:rStyle w:val="NormalTok"/>
+        </w:rPr>
+        <w:t xml:space="preserve"> </w:t>
+      </w:r>
+      <w:r>
+        <w:rPr>
+          <w:rStyle w:val="StringTok"/>
+        </w:rPr>
+        <w:t xml:space="preserve">"single"</w:t>
+      </w:r>
+      <w:r>
+        <w:rPr>
+          <w:rStyle w:val="NormalTok"/>
+        </w:rPr>
+        <w:t xml:space="preserve">)</w:t>
+      </w:r>
+      <w:r>
+        <w:br/>
+      </w:r>
+      <w:r>
+        <w:rPr>
+          <w:rStyle w:val="NormalTok"/>
+        </w:rPr>
+        <w:t xml:space="preserve">  ) </w:t>
+      </w:r>
+      <w:r>
+        <w:rPr>
+          <w:rStyle w:val="SpecialCharTok"/>
+        </w:rPr>
+        <w:t xml:space="preserve">+</w:t>
+      </w:r>
+      <w:r>
+        <w:br/>
+      </w:r>
+      <w:r>
+        <w:rPr>
+          <w:rStyle w:val="NormalTok"/>
+        </w:rPr>
+        <w:t xml:space="preserve">  </w:t>
+      </w:r>
+      <w:r>
+        <w:rPr>
+          <w:rStyle w:val="FunctionTok"/>
+        </w:rPr>
+        <w:t xml:space="preserve">geom_linerange</w:t>
+      </w:r>
+      <w:r>
+        <w:rPr>
+          <w:rStyle w:val="NormalTok"/>
+        </w:rPr>
+        <w:t xml:space="preserve">(</w:t>
+      </w:r>
+      <w:r>
+        <w:rPr>
+          <w:rStyle w:val="FunctionTok"/>
+        </w:rPr>
+        <w:t xml:space="preserve">aes</w:t>
+      </w:r>
+      <w:r>
+        <w:rPr>
+          <w:rStyle w:val="NormalTok"/>
+        </w:rPr>
+        <w:t xml:space="preserve">(</w:t>
+      </w:r>
+      <w:r>
+        <w:rPr>
+          <w:rStyle w:val="AttributeTok"/>
+        </w:rPr>
+        <w:t xml:space="preserve">xmin =</w:t>
+      </w:r>
+      <w:r>
+        <w:rPr>
+          <w:rStyle w:val="NormalTok"/>
+        </w:rPr>
+        <w:t xml:space="preserve"> CI.lwr </w:t>
+      </w:r>
+      <w:r>
+        <w:rPr>
+          <w:rStyle w:val="SpecialCharTok"/>
+        </w:rPr>
+        <w:t xml:space="preserve">*</w:t>
+      </w:r>
+      <w:r>
+        <w:rPr>
+          <w:rStyle w:val="NormalTok"/>
+        </w:rPr>
+        <w:t xml:space="preserve"> </w:t>
+      </w:r>
+      <w:r>
+        <w:rPr>
+          <w:rStyle w:val="DecValTok"/>
+        </w:rPr>
+        <w:t xml:space="preserve">1000</w:t>
+      </w:r>
+      <w:r>
+        <w:rPr>
+          <w:rStyle w:val="NormalTok"/>
+        </w:rPr>
+        <w:t xml:space="preserve">, </w:t>
+      </w:r>
+      <w:r>
+        <w:rPr>
+          <w:rStyle w:val="AttributeTok"/>
+        </w:rPr>
+        <w:t xml:space="preserve">xmax =</w:t>
+      </w:r>
+      <w:r>
+        <w:rPr>
+          <w:rStyle w:val="NormalTok"/>
+        </w:rPr>
+        <w:t xml:space="preserve"> CI.upr </w:t>
+      </w:r>
+      <w:r>
+        <w:rPr>
+          <w:rStyle w:val="SpecialCharTok"/>
+        </w:rPr>
+        <w:t xml:space="preserve">*</w:t>
+      </w:r>
+      <w:r>
+        <w:rPr>
+          <w:rStyle w:val="NormalTok"/>
+        </w:rPr>
+        <w:t xml:space="preserve"> </w:t>
+      </w:r>
+      <w:r>
+        <w:rPr>
+          <w:rStyle w:val="DecValTok"/>
+        </w:rPr>
+        <w:t xml:space="preserve">1000</w:t>
+      </w:r>
+      <w:r>
+        <w:rPr>
+          <w:rStyle w:val="NormalTok"/>
+        </w:rPr>
+        <w:t xml:space="preserve">),</w:t>
+      </w:r>
+      <w:r>
+        <w:br/>
+      </w:r>
+      <w:r>
+        <w:rPr>
+          <w:rStyle w:val="NormalTok"/>
+        </w:rPr>
+        <w:t xml:space="preserve">                 </w:t>
+      </w:r>
+      <w:r>
+        <w:rPr>
+          <w:rStyle w:val="AttributeTok"/>
+        </w:rPr>
+        <w:t xml:space="preserve">position =</w:t>
+      </w:r>
+      <w:r>
+        <w:rPr>
+          <w:rStyle w:val="NormalTok"/>
+        </w:rPr>
+        <w:t xml:space="preserve"> </w:t>
+      </w:r>
+      <w:r>
+        <w:rPr>
+          <w:rStyle w:val="FunctionTok"/>
+        </w:rPr>
+        <w:t xml:space="preserve">position_dodge2</w:t>
+      </w:r>
+      <w:r>
+        <w:rPr>
+          <w:rStyle w:val="NormalTok"/>
+        </w:rPr>
+        <w:t xml:space="preserve">(</w:t>
+      </w:r>
+      <w:r>
+        <w:rPr>
+          <w:rStyle w:val="AttributeTok"/>
+        </w:rPr>
+        <w:t xml:space="preserve">width =</w:t>
+      </w:r>
+      <w:r>
+        <w:rPr>
+          <w:rStyle w:val="NormalTok"/>
+        </w:rPr>
+        <w:t xml:space="preserve"> </w:t>
+      </w:r>
+      <w:r>
+        <w:rPr>
+          <w:rStyle w:val="FloatTok"/>
+        </w:rPr>
+        <w:t xml:space="preserve">0.8</w:t>
+      </w:r>
+      <w:r>
+        <w:rPr>
+          <w:rStyle w:val="NormalTok"/>
+        </w:rPr>
+        <w:t xml:space="preserve">, </w:t>
+      </w:r>
+      <w:r>
+        <w:rPr>
+          <w:rStyle w:val="AttributeTok"/>
+        </w:rPr>
+        <w:t xml:space="preserve">preserve =</w:t>
+      </w:r>
+      <w:r>
+        <w:rPr>
+          <w:rStyle w:val="NormalTok"/>
+        </w:rPr>
+        <w:t xml:space="preserve"> </w:t>
+      </w:r>
+      <w:r>
+        <w:rPr>
+          <w:rStyle w:val="StringTok"/>
+        </w:rPr>
+        <w:t xml:space="preserve">"single"</w:t>
+      </w:r>
+      <w:r>
+        <w:rPr>
+          <w:rStyle w:val="NormalTok"/>
+        </w:rPr>
+        <w:t xml:space="preserve">)) </w:t>
+      </w:r>
+      <w:r>
+        <w:rPr>
+          <w:rStyle w:val="SpecialCharTok"/>
+        </w:rPr>
+        <w:t xml:space="preserve">+</w:t>
+      </w:r>
+      <w:r>
+        <w:br/>
+      </w:r>
+      <w:r>
+        <w:rPr>
+          <w:rStyle w:val="NormalTok"/>
+        </w:rPr>
+        <w:t xml:space="preserve">  </w:t>
+      </w:r>
+      <w:r>
+        <w:rPr>
+          <w:rStyle w:val="FunctionTok"/>
+        </w:rPr>
+        <w:t xml:space="preserve">labs</w:t>
+      </w:r>
+      <w:r>
+        <w:rPr>
+          <w:rStyle w:val="NormalTok"/>
+        </w:rPr>
+        <w:t xml:space="preserve">(</w:t>
+      </w:r>
+      <w:r>
+        <w:rPr>
+          <w:rStyle w:val="AttributeTok"/>
+        </w:rPr>
+        <w:t xml:space="preserve">title =</w:t>
+      </w:r>
+      <w:r>
+        <w:rPr>
+          <w:rStyle w:val="NormalTok"/>
+        </w:rPr>
+        <w:t xml:space="preserve"> </w:t>
+      </w:r>
+      <w:r>
+        <w:rPr>
+          <w:rStyle w:val="StringTok"/>
+        </w:rPr>
+        <w:t xml:space="preserve">"Enteric Fever Seroincidence by Catchment Area"</w:t>
+      </w:r>
+      <w:r>
+        <w:rPr>
+          <w:rStyle w:val="NormalTok"/>
+        </w:rPr>
+        <w:t xml:space="preserve">,</w:t>
+      </w:r>
+      <w:r>
+        <w:br/>
+      </w:r>
+      <w:r>
+        <w:rPr>
+          <w:rStyle w:val="NormalTok"/>
+        </w:rPr>
+        <w:t xml:space="preserve">       </w:t>
+      </w:r>
+      <w:r>
+        <w:rPr>
+          <w:rStyle w:val="AttributeTok"/>
+        </w:rPr>
+        <w:t xml:space="preserve">x =</w:t>
+      </w:r>
+      <w:r>
+        <w:rPr>
+          <w:rStyle w:val="NormalTok"/>
+        </w:rPr>
+        <w:t xml:space="preserve"> </w:t>
+      </w:r>
+      <w:r>
+        <w:rPr>
+          <w:rStyle w:val="StringTok"/>
+        </w:rPr>
+        <w:t xml:space="preserve">"Seroincience rate per 1000 person-years"</w:t>
+      </w:r>
+      <w:r>
+        <w:rPr>
+          <w:rStyle w:val="NormalTok"/>
+        </w:rPr>
+        <w:t xml:space="preserve">,</w:t>
+      </w:r>
+      <w:r>
+        <w:br/>
+      </w:r>
+      <w:r>
+        <w:rPr>
+          <w:rStyle w:val="NormalTok"/>
+        </w:rPr>
+        <w:t xml:space="preserve">       </w:t>
+      </w:r>
+      <w:r>
+        <w:rPr>
+          <w:rStyle w:val="AttributeTok"/>
+        </w:rPr>
+        <w:t xml:space="preserve">y =</w:t>
+      </w:r>
+      <w:r>
+        <w:rPr>
+          <w:rStyle w:val="NormalTok"/>
+        </w:rPr>
+        <w:t xml:space="preserve"> </w:t>
+      </w:r>
+      <w:r>
+        <w:rPr>
+          <w:rStyle w:val="StringTok"/>
+        </w:rPr>
+        <w:t xml:space="preserve">"Catchment"</w:t>
+      </w:r>
+      <w:r>
+        <w:rPr>
+          <w:rStyle w:val="NormalTok"/>
+        </w:rPr>
+        <w:t xml:space="preserve">) </w:t>
+      </w:r>
+      <w:r>
+        <w:rPr>
+          <w:rStyle w:val="SpecialCharTok"/>
+        </w:rPr>
+        <w:t xml:space="preserve">+</w:t>
+      </w:r>
+      <w:r>
+        <w:br/>
+      </w:r>
+      <w:r>
+        <w:rPr>
+          <w:rStyle w:val="NormalTok"/>
+        </w:rPr>
+        <w:t xml:space="preserve">  </w:t>
+      </w:r>
+      <w:r>
+        <w:rPr>
+          <w:rStyle w:val="FunctionTok"/>
+        </w:rPr>
+        <w:t xml:space="preserve">theme_bw</w:t>
+      </w:r>
+      <w:r>
+        <w:rPr>
+          <w:rStyle w:val="NormalTok"/>
+        </w:rPr>
+        <w:t xml:space="preserve">() </w:t>
+      </w:r>
+      <w:r>
+        <w:rPr>
+          <w:rStyle w:val="SpecialCharTok"/>
+        </w:rPr>
+        <w:t xml:space="preserve">+</w:t>
+      </w:r>
+      <w:r>
+        <w:br/>
+      </w:r>
+      <w:r>
+        <w:rPr>
+          <w:rStyle w:val="NormalTok"/>
+        </w:rPr>
+        <w:t xml:space="preserve">  </w:t>
+      </w:r>
+      <w:r>
+        <w:rPr>
+          <w:rStyle w:val="FunctionTok"/>
+        </w:rPr>
+        <w:t xml:space="preserve">facet_wrap</w:t>
+      </w:r>
+      <w:r>
+        <w:rPr>
+          <w:rStyle w:val="NormalTok"/>
+        </w:rPr>
+        <w:t xml:space="preserve">(</w:t>
+      </w:r>
+      <w:r>
+        <w:rPr>
+          <w:rStyle w:val="SpecialCharTok"/>
+        </w:rPr>
+        <w:t xml:space="preserve">~</w:t>
+      </w:r>
+      <w:r>
+        <w:rPr>
+          <w:rStyle w:val="NormalTok"/>
+        </w:rPr>
+        <w:t xml:space="preserve"> country) </w:t>
+      </w:r>
+      <w:r>
+        <w:rPr>
+          <w:rStyle w:val="SpecialCharTok"/>
+        </w:rPr>
+        <w:t xml:space="preserve">+</w:t>
+      </w:r>
+      <w:r>
+        <w:br/>
+      </w:r>
+      <w:r>
+        <w:rPr>
+          <w:rStyle w:val="NormalTok"/>
+        </w:rPr>
+        <w:t xml:space="preserve">  </w:t>
+      </w:r>
+      <w:r>
+        <w:rPr>
+          <w:rStyle w:val="FunctionTok"/>
+        </w:rPr>
+        <w:t xml:space="preserve">theme</w:t>
+      </w:r>
+      <w:r>
+        <w:rPr>
+          <w:rStyle w:val="NormalTok"/>
+        </w:rPr>
+        <w:t xml:space="preserve">(</w:t>
+      </w:r>
+      <w:r>
+        <w:rPr>
+          <w:rStyle w:val="AttributeTok"/>
+        </w:rPr>
+        <w:t xml:space="preserve">axis.text.y =</w:t>
+      </w:r>
+      <w:r>
+        <w:rPr>
+          <w:rStyle w:val="NormalTok"/>
+        </w:rPr>
+        <w:t xml:space="preserve"> </w:t>
+      </w:r>
+      <w:r>
+        <w:rPr>
+          <w:rStyle w:val="FunctionTok"/>
+        </w:rPr>
+        <w:t xml:space="preserve">element_text</w:t>
+      </w:r>
+      <w:r>
+        <w:rPr>
+          <w:rStyle w:val="NormalTok"/>
+        </w:rPr>
+        <w:t xml:space="preserve">(</w:t>
+      </w:r>
+      <w:r>
+        <w:rPr>
+          <w:rStyle w:val="AttributeTok"/>
+        </w:rPr>
+        <w:t xml:space="preserve">size =</w:t>
+      </w:r>
+      <w:r>
+        <w:rPr>
+          <w:rStyle w:val="NormalTok"/>
+        </w:rPr>
+        <w:t xml:space="preserve"> </w:t>
+      </w:r>
+      <w:r>
+        <w:rPr>
+          <w:rStyle w:val="DecValTok"/>
+        </w:rPr>
+        <w:t xml:space="preserve">11</w:t>
+      </w:r>
+      <w:r>
+        <w:rPr>
+          <w:rStyle w:val="NormalTok"/>
+        </w:rPr>
+        <w:t xml:space="preserve">),</w:t>
+      </w:r>
+      <w:r>
+        <w:br/>
+      </w:r>
+      <w:r>
+        <w:rPr>
+          <w:rStyle w:val="NormalTok"/>
+        </w:rPr>
+        <w:t xml:space="preserve">        </w:t>
+      </w:r>
+      <w:r>
+        <w:rPr>
+          <w:rStyle w:val="AttributeTok"/>
+        </w:rPr>
+        <w:t xml:space="preserve">axis.text.x =</w:t>
+      </w:r>
+      <w:r>
+        <w:rPr>
+          <w:rStyle w:val="NormalTok"/>
+        </w:rPr>
+        <w:t xml:space="preserve"> </w:t>
+      </w:r>
+      <w:r>
+        <w:rPr>
+          <w:rStyle w:val="FunctionTok"/>
+        </w:rPr>
+        <w:t xml:space="preserve">element_text</w:t>
+      </w:r>
+      <w:r>
+        <w:rPr>
+          <w:rStyle w:val="NormalTok"/>
+        </w:rPr>
+        <w:t xml:space="preserve">(</w:t>
+      </w:r>
+      <w:r>
+        <w:rPr>
+          <w:rStyle w:val="AttributeTok"/>
+        </w:rPr>
+        <w:t xml:space="preserve">size =</w:t>
+      </w:r>
+      <w:r>
+        <w:rPr>
+          <w:rStyle w:val="NormalTok"/>
+        </w:rPr>
+        <w:t xml:space="preserve"> </w:t>
+      </w:r>
+      <w:r>
+        <w:rPr>
+          <w:rStyle w:val="DecValTok"/>
+        </w:rPr>
+        <w:t xml:space="preserve">11</w:t>
+      </w:r>
+      <w:r>
+        <w:rPr>
+          <w:rStyle w:val="NormalTok"/>
+        </w:rPr>
+        <w:t xml:space="preserve">)) </w:t>
+      </w:r>
+      <w:r>
+        <w:rPr>
+          <w:rStyle w:val="SpecialCharTok"/>
+        </w:rPr>
+        <w:t xml:space="preserve">+</w:t>
+      </w:r>
+      <w:r>
+        <w:br/>
+      </w:r>
+      <w:r>
+        <w:rPr>
+          <w:rStyle w:val="NormalTok"/>
+        </w:rPr>
+        <w:t xml:space="preserve">  </w:t>
+      </w:r>
+      <w:r>
+        <w:rPr>
+          <w:rStyle w:val="FunctionTok"/>
+        </w:rPr>
+        <w:t xml:space="preserve">scale_fill_manual</w:t>
+      </w:r>
+      <w:r>
+        <w:rPr>
+          <w:rStyle w:val="NormalTok"/>
+        </w:rPr>
+        <w:t xml:space="preserve">(</w:t>
+      </w:r>
+      <w:r>
+        <w:rPr>
+          <w:rStyle w:val="AttributeTok"/>
+        </w:rPr>
+        <w:t xml:space="preserve">values =</w:t>
+      </w:r>
+      <w:r>
+        <w:rPr>
+          <w:rStyle w:val="NormalTok"/>
+        </w:rPr>
+        <w:t xml:space="preserve"> </w:t>
+      </w:r>
+      <w:r>
+        <w:rPr>
+          <w:rStyle w:val="FunctionTok"/>
+        </w:rPr>
+        <w:t xml:space="preserve">c</w:t>
+      </w:r>
+      <w:r>
+        <w:rPr>
+          <w:rStyle w:val="NormalTok"/>
+        </w:rPr>
+        <w:t xml:space="preserve">(</w:t>
+      </w:r>
+      <w:r>
+        <w:rPr>
+          <w:rStyle w:val="StringTok"/>
+        </w:rPr>
+        <w:t xml:space="preserve">"orange2"</w:t>
+      </w:r>
+      <w:r>
+        <w:rPr>
+          <w:rStyle w:val="NormalTok"/>
+        </w:rPr>
+        <w:t xml:space="preserve">, </w:t>
+      </w:r>
+      <w:r>
+        <w:rPr>
+          <w:rStyle w:val="StringTok"/>
+        </w:rPr>
+        <w:t xml:space="preserve">"#39558CFF"</w:t>
+      </w:r>
+      <w:r>
+        <w:rPr>
+          <w:rStyle w:val="NormalTok"/>
+        </w:rPr>
+        <w:t xml:space="preserve">, </w:t>
+      </w:r>
+      <w:r>
+        <w:rPr>
+          <w:rStyle w:val="StringTok"/>
+        </w:rPr>
+        <w:t xml:space="preserve">"red"</w:t>
+      </w:r>
+      <w:r>
+        <w:rPr>
+          <w:rStyle w:val="NormalTok"/>
+        </w:rPr>
+        <w:t xml:space="preserve">))</w:t>
+      </w:r>
+    </w:p>
+    <w:p>
+      <w:pPr>
+        <w:pStyle w:val="FirstParagraph"/>
       </w:pPr>
       <w:r>
         <w:drawing>

</xml_diff>

<commit_message>
Deploying to gh-pages from @ UCD-SERG/serocalculator@2aa4dfc51202652fef6d72c3c4fcaa8333f74653 🚀
</commit_message>
<xml_diff>
--- a/dev/vignettes/articles/scrubTyphus_example.docx
+++ b/dev/vignettes/articles/scrubTyphus_example.docx
@@ -505,7 +505,34 @@
         <w:t xml:space="preserve"> </w:t>
       </w:r>
       <w:r>
-        <w:t xml:space="preserve">on Open Science Framework (OSF). We will pull this data directly into our R environment.</w:t>
+        <w:t xml:space="preserve">on Open Science Framework (OSF).</w:t>
+      </w:r>
+      <w:r>
+        <w:t xml:space="preserve"> </w:t>
+      </w:r>
+      <w:r>
+        <w:t xml:space="preserve">This vignette reads local, vendored copies of that data instead of fetching them at render time, so the documentation build doesn’t depend on OSF’s own availability — see</w:t>
+      </w:r>
+      <w:r>
+        <w:t xml:space="preserve"> </w:t>
+      </w:r>
+      <w:r>
+        <w:rPr>
+          <w:rStyle w:val="VerbatimChar"/>
+        </w:rPr>
+        <w:t xml:space="preserve">vignettes/precomputed/osf/README.md</w:t>
+      </w:r>
+      <w:r>
+        <w:t xml:space="preserve"> </w:t>
+      </w:r>
+      <w:r>
+        <w:t xml:space="preserve">for why and how to refresh them.</w:t>
+      </w:r>
+      <w:r>
+        <w:t xml:space="preserve"> </w:t>
+      </w:r>
+      <w:r>
+        <w:t xml:space="preserve">When adapting this code to your own analysis, replace the vendored paths below with the OSF download URL (or your own local file).</w:t>
       </w:r>
     </w:p>
     <w:bookmarkStart w:id="18" w:name="X1714420ab9e2734f8369f5ee70a749859cd59dc"/>
@@ -533,10 +560,7 @@
         <w:rPr>
           <w:rStyle w:val="CommentTok"/>
         </w:rPr>
-        <w:t xml:space="preserve"># Import longitudinal antibody parameters from OSF</w:t>
-      </w:r>
-      <w:r>
-        <w:br/>
+        <w:t xml:space="preserve"># Vendored from OSF (osf.io/u5gxh).</w:t>
       </w:r>
       <w:r>
         <w:br/>
@@ -566,7 +590,7 @@
         <w:rPr>
           <w:rStyle w:val="StringTok"/>
         </w:rPr>
-        <w:t xml:space="preserve">"https://osf.io/download/u5gxh/"</w:t>
+        <w:t xml:space="preserve">"../precomputed/osf/u5gxh.rds"</w:t>
       </w:r>
       <w:r>
         <w:rPr>
@@ -579,12 +603,6 @@
           <w:rStyle w:val="SpecialCharTok"/>
         </w:rPr>
         <w:t xml:space="preserve">|&gt;</w:t>
-      </w:r>
-      <w:r>
-        <w:rPr>
-          <w:rStyle w:val="NormalTok"/>
-        </w:rPr>
-        <w:t xml:space="preserve"> </w:t>
       </w:r>
       <w:r>
         <w:br/>
@@ -767,7 +785,7 @@
         <w:rPr>
           <w:rStyle w:val="CommentTok"/>
         </w:rPr>
-        <w:t xml:space="preserve"># Import cross-sectional data from OSF and rename required variables</w:t>
+        <w:t xml:space="preserve"># Vendored from OSF (osf.io/h5js4); renamed to the required variable names.</w:t>
       </w:r>
       <w:r>
         <w:br/>
@@ -827,7 +845,7 @@
         <w:rPr>
           <w:rStyle w:val="StringTok"/>
         </w:rPr>
-        <w:t xml:space="preserve">"https://osf.io/download/h5js4/"</w:t>
+        <w:t xml:space="preserve">"../precomputed/osf/h5js4.rds"</w:t>
       </w:r>
       <w:r>
         <w:rPr>

</xml_diff>